<commit_message>
feat(static): harden PE evidence extraction and automate verification
Analyze one captured byte sequence with a configurable 50 MiB default
input limit. Add section permissions, nonfatal parser warnings, and
separate named and ordinal delay imports.

Introduce report contract 1.2.0 while preserving existing field meanings
and ordinary-import counts. Bound sample-list storage while retaining
full string values and exact unique counts; defer the character cap.

Expand automated coverage to 36 tests and add GitHub Actions checks on
Windows and Ubuntu. Update the schema, validator, field documentation,
PowerShell demo, and team handoff.

Validated locally with the complete test suite, workflow linting, and
trusted Notepad analysis whose SHA-256 matched PowerShell Get-FileHash.
GitHub-hosted execution and Word visual QA remain pending.

URL analysis, YARA, reputation lookups, and ML/backend integration remain
deferred. The input limit is not a sandbox or complete resource limit.
</commit_message>
<xml_diff>
--- a/Sentinel_Malware_Detection_Documentation_Form.docx
+++ b/Sentinel_Malware_Detection_Documentation_Form.docx
@@ -271,7 +271,7 @@
                 <w:b w:val="0"/>
                 <w:sz w:val="17"/>
               </w:rPr>
-              <w:t>2026-09-22 (milestone 4 demo rehearsal)</w:t>
+              <w:t>2026-10-01 (static analyzer improvements and demo)</w:t>
             </w:r>
           </w:p>
         </w:tc>
@@ -315,7 +315,7 @@
                 <w:b w:val="0"/>
                 <w:sz w:val="17"/>
               </w:rPr>
-              <w:t>CS-4398-Project / malware-detection</w:t>
+              <w:t>CS-4398-Project / static-link-analysis</w:t>
             </w:r>
           </w:p>
         </w:tc>
@@ -359,7 +359,7 @@
                 <w:b w:val="0"/>
                 <w:sz w:val="17"/>
               </w:rPr>
-              <w:t>Milestone 4: repeatable demo and handoff</w:t>
+              <w:t>Six local improvement commits; ready for review</w:t>
             </w:r>
           </w:p>
         </w:tc>
@@ -403,7 +403,7 @@
                 <w:b w:val="0"/>
                 <w:sz w:val="17"/>
               </w:rPr>
-              <w:t>M1-M4 complete. Ready for team review; approval and Word visual review pending.</w:t>
+              <w:t>S1-S6 complete with full string samples retained by request. Local review pending; Word visual QA unavailable.</w:t>
             </w:r>
           </w:p>
         </w:tc>
@@ -604,7 +604,7 @@
                 <w:b w:val="0"/>
                 <w:sz w:val="17"/>
               </w:rPr>
-              <w:t>Delivered increment: local static evidence extraction, regression tests, validated report contract, and demo/handoff documentation. Signature lookup, YARA, classifier integration, and performance validation remain planned. Full proposal requirement mapping is pending.</w:t>
+              <w:t>Delivered: bounded consistent-byte analysis, section permissions, parser warnings, delay imports, bounded sample storage, CLI/contract tests, and updated demo. Full sample strings retained by request. URL analysis, YARA, hash reputation, and ML/backend integration remain deferred.</w:t>
             </w:r>
           </w:p>
         </w:tc>
@@ -1718,13 +1718,8 @@
             <w:pPr>
               <w:spacing w:after="0"/>
             </w:pPr>
-            <w:r/>
-            <w:r>
-              <w:rPr>
-                <w:rFonts w:ascii="Aptos" w:hAnsi="Aptos"/>
-                <w:b w:val="0"/>
-                <w:sz w:val="17"/>
-              </w:rPr>
+            <w:r>
+              <w:t>2026-10-01</w:t>
             </w:r>
           </w:p>
         </w:tc>
@@ -1737,13 +1732,8 @@
             <w:pPr>
               <w:spacing w:after="0"/>
             </w:pPr>
-            <w:r/>
-            <w:r>
-              <w:rPr>
-                <w:rFonts w:ascii="Aptos" w:hAnsi="Aptos"/>
-                <w:b w:val="0"/>
-                <w:sz w:val="17"/>
-              </w:rPr>
+            <w:r>
+              <w:t>S1</w:t>
             </w:r>
           </w:p>
         </w:tc>
@@ -1756,13 +1746,8 @@
             <w:pPr>
               <w:spacing w:after="0"/>
             </w:pPr>
-            <w:r/>
-            <w:r>
-              <w:rPr>
-                <w:rFonts w:ascii="Aptos" w:hAnsi="Aptos"/>
-                <w:b w:val="0"/>
-                <w:sz w:val="17"/>
-              </w:rPr>
+            <w:r>
+              <w:t>Bounded byte capture</w:t>
             </w:r>
           </w:p>
         </w:tc>
@@ -1775,13 +1760,8 @@
             <w:pPr>
               <w:spacing w:after="0"/>
             </w:pPr>
-            <w:r/>
-            <w:r>
-              <w:rPr>
-                <w:rFonts w:ascii="Aptos" w:hAnsi="Aptos"/>
-                <w:b w:val="0"/>
-                <w:sz w:val="17"/>
-              </w:rPr>
+            <w:r>
+              <w:t>Consistent evidence</w:t>
             </w:r>
           </w:p>
         </w:tc>
@@ -1794,13 +1774,8 @@
             <w:pPr>
               <w:spacing w:after="0"/>
             </w:pPr>
-            <w:r/>
-            <w:r>
-              <w:rPr>
-                <w:rFonts w:ascii="Aptos" w:hAnsi="Aptos"/>
-                <w:b w:val="0"/>
-                <w:sz w:val="17"/>
-              </w:rPr>
+            <w:r>
+              <w:t>E1-E4, E7, E9</w:t>
             </w:r>
           </w:p>
         </w:tc>
@@ -1813,13 +1788,8 @@
             <w:pPr>
               <w:spacing w:after="0"/>
             </w:pPr>
-            <w:r/>
-            <w:r>
-              <w:rPr>
-                <w:rFonts w:ascii="Aptos" w:hAnsi="Aptos"/>
-                <w:b w:val="0"/>
-                <w:sz w:val="17"/>
-              </w:rPr>
+            <w:r>
+              <w:t>S1</w:t>
             </w:r>
           </w:p>
         </w:tc>
@@ -1832,13 +1802,8 @@
             <w:pPr>
               <w:spacing w:after="0"/>
             </w:pPr>
-            <w:r/>
-            <w:r>
-              <w:rPr>
-                <w:rFonts w:ascii="Aptos" w:hAnsi="Aptos"/>
-                <w:b w:val="0"/>
-                <w:sz w:val="17"/>
-              </w:rPr>
+            <w:r>
+              <w:t>23 passed</w:t>
             </w:r>
           </w:p>
         </w:tc>
@@ -1851,13 +1816,8 @@
             <w:pPr>
               <w:spacing w:after="0"/>
             </w:pPr>
-            <w:r/>
-            <w:r>
-              <w:rPr>
-                <w:rFonts w:ascii="Aptos" w:hAnsi="Aptos"/>
-                <w:b w:val="0"/>
-                <w:sz w:val="17"/>
-              </w:rPr>
+            <w:r>
+              <w:t>169f0be</w:t>
             </w:r>
           </w:p>
         </w:tc>
@@ -1870,13 +1830,8 @@
             <w:pPr>
               <w:spacing w:after="0"/>
             </w:pPr>
-            <w:r/>
-            <w:r>
-              <w:rPr>
-                <w:rFonts w:ascii="Aptos" w:hAnsi="Aptos"/>
-                <w:b w:val="0"/>
-                <w:sz w:val="17"/>
-              </w:rPr>
+            <w:r>
+              <w:t>Codex; Kyle review</w:t>
             </w:r>
           </w:p>
         </w:tc>
@@ -1889,13 +1844,733 @@
             <w:pPr>
               <w:spacing w:after="0"/>
             </w:pPr>
-            <w:r/>
-            <w:r>
-              <w:rPr>
-                <w:rFonts w:ascii="Aptos" w:hAnsi="Aptos"/>
-                <w:b w:val="0"/>
-                <w:sz w:val="17"/>
-              </w:rPr>
+            <w:r>
+              <w:t>Pending</w:t>
+            </w:r>
+          </w:p>
+        </w:tc>
+      </w:tr>
+      <w:tr>
+        <w:trPr>
+          <w:cantSplit/>
+        </w:trPr>
+        <w:tc>
+          <w:tcPr>
+            <w:tcW w:type="dxa" w:w="1022"/>
+            <w:vAlign w:val="center"/>
+          </w:tcPr>
+          <w:p>
+            <w:pPr>
+              <w:spacing w:after="0"/>
+            </w:pPr>
+            <w:r>
+              <w:t>2026-10-01</w:t>
+            </w:r>
+          </w:p>
+        </w:tc>
+        <w:tc>
+          <w:tcPr>
+            <w:tcW w:type="dxa" w:w="1022"/>
+            <w:vAlign w:val="center"/>
+          </w:tcPr>
+          <w:p>
+            <w:pPr>
+              <w:spacing w:after="0"/>
+            </w:pPr>
+            <w:r>
+              <w:t>S2</w:t>
+            </w:r>
+          </w:p>
+        </w:tc>
+        <w:tc>
+          <w:tcPr>
+            <w:tcW w:type="dxa" w:w="1022"/>
+            <w:vAlign w:val="center"/>
+          </w:tcPr>
+          <w:p>
+            <w:pPr>
+              <w:spacing w:after="0"/>
+            </w:pPr>
+            <w:r>
+              <w:t>Permissions; warnings</w:t>
+            </w:r>
+          </w:p>
+        </w:tc>
+        <w:tc>
+          <w:tcPr>
+            <w:tcW w:type="dxa" w:w="1022"/>
+            <w:vAlign w:val="center"/>
+          </w:tcPr>
+          <w:p>
+            <w:pPr>
+              <w:spacing w:after="0"/>
+            </w:pPr>
+            <w:r>
+              <w:t>Parser evidence</w:t>
+            </w:r>
+          </w:p>
+        </w:tc>
+        <w:tc>
+          <w:tcPr>
+            <w:tcW w:type="dxa" w:w="1022"/>
+            <w:vAlign w:val="center"/>
+          </w:tcPr>
+          <w:p>
+            <w:pPr>
+              <w:spacing w:after="0"/>
+            </w:pPr>
+            <w:r>
+              <w:t>E3, E6-E9</w:t>
+            </w:r>
+          </w:p>
+        </w:tc>
+        <w:tc>
+          <w:tcPr>
+            <w:tcW w:type="dxa" w:w="1022"/>
+            <w:vAlign w:val="center"/>
+          </w:tcPr>
+          <w:p>
+            <w:pPr>
+              <w:spacing w:after="0"/>
+            </w:pPr>
+            <w:r>
+              <w:t>S2</w:t>
+            </w:r>
+          </w:p>
+        </w:tc>
+        <w:tc>
+          <w:tcPr>
+            <w:tcW w:type="dxa" w:w="1022"/>
+            <w:vAlign w:val="center"/>
+          </w:tcPr>
+          <w:p>
+            <w:pPr>
+              <w:spacing w:after="0"/>
+            </w:pPr>
+            <w:r>
+              <w:t>26 passed</w:t>
+            </w:r>
+          </w:p>
+        </w:tc>
+        <w:tc>
+          <w:tcPr>
+            <w:tcW w:type="dxa" w:w="1022"/>
+            <w:vAlign w:val="center"/>
+          </w:tcPr>
+          <w:p>
+            <w:pPr>
+              <w:spacing w:after="0"/>
+            </w:pPr>
+            <w:r>
+              <w:t>591bdfd</w:t>
+            </w:r>
+          </w:p>
+        </w:tc>
+        <w:tc>
+          <w:tcPr>
+            <w:tcW w:type="dxa" w:w="1022"/>
+            <w:vAlign w:val="center"/>
+          </w:tcPr>
+          <w:p>
+            <w:pPr>
+              <w:spacing w:after="0"/>
+            </w:pPr>
+            <w:r>
+              <w:t>Codex; Kyle review</w:t>
+            </w:r>
+          </w:p>
+        </w:tc>
+        <w:tc>
+          <w:tcPr>
+            <w:tcW w:type="dxa" w:w="1022"/>
+            <w:vAlign w:val="center"/>
+          </w:tcPr>
+          <w:p>
+            <w:pPr>
+              <w:spacing w:after="0"/>
+            </w:pPr>
+            <w:r>
+              <w:t>Pending</w:t>
+            </w:r>
+          </w:p>
+        </w:tc>
+      </w:tr>
+      <w:tr>
+        <w:trPr>
+          <w:cantSplit/>
+        </w:trPr>
+        <w:tc>
+          <w:tcPr>
+            <w:tcW w:type="dxa" w:w="1022"/>
+            <w:vAlign w:val="center"/>
+          </w:tcPr>
+          <w:p>
+            <w:pPr>
+              <w:spacing w:after="0"/>
+            </w:pPr>
+            <w:r>
+              <w:t>2026-10-01</w:t>
+            </w:r>
+          </w:p>
+        </w:tc>
+        <w:tc>
+          <w:tcPr>
+            <w:tcW w:type="dxa" w:w="1022"/>
+            <w:vAlign w:val="center"/>
+          </w:tcPr>
+          <w:p>
+            <w:pPr>
+              <w:spacing w:after="0"/>
+            </w:pPr>
+            <w:r>
+              <w:t>S3</w:t>
+            </w:r>
+          </w:p>
+        </w:tc>
+        <w:tc>
+          <w:tcPr>
+            <w:tcW w:type="dxa" w:w="1022"/>
+            <w:vAlign w:val="center"/>
+          </w:tcPr>
+          <w:p>
+            <w:pPr>
+              <w:spacing w:after="0"/>
+            </w:pPr>
+            <w:r>
+              <w:t>Delay imports</w:t>
+            </w:r>
+          </w:p>
+        </w:tc>
+        <w:tc>
+          <w:tcPr>
+            <w:tcW w:type="dxa" w:w="1022"/>
+            <w:vAlign w:val="center"/>
+          </w:tcPr>
+          <w:p>
+            <w:pPr>
+              <w:spacing w:after="0"/>
+            </w:pPr>
+            <w:r>
+              <w:t>Separate evidence</w:t>
+            </w:r>
+          </w:p>
+        </w:tc>
+        <w:tc>
+          <w:tcPr>
+            <w:tcW w:type="dxa" w:w="1022"/>
+            <w:vAlign w:val="center"/>
+          </w:tcPr>
+          <w:p>
+            <w:pPr>
+              <w:spacing w:after="0"/>
+            </w:pPr>
+            <w:r>
+              <w:t>E1, E3, E6-E9</w:t>
+            </w:r>
+          </w:p>
+        </w:tc>
+        <w:tc>
+          <w:tcPr>
+            <w:tcW w:type="dxa" w:w="1022"/>
+            <w:vAlign w:val="center"/>
+          </w:tcPr>
+          <w:p>
+            <w:pPr>
+              <w:spacing w:after="0"/>
+            </w:pPr>
+            <w:r>
+              <w:t>S3</w:t>
+            </w:r>
+          </w:p>
+        </w:tc>
+        <w:tc>
+          <w:tcPr>
+            <w:tcW w:type="dxa" w:w="1022"/>
+            <w:vAlign w:val="center"/>
+          </w:tcPr>
+          <w:p>
+            <w:pPr>
+              <w:spacing w:after="0"/>
+            </w:pPr>
+            <w:r>
+              <w:t>28 passed</w:t>
+            </w:r>
+          </w:p>
+        </w:tc>
+        <w:tc>
+          <w:tcPr>
+            <w:tcW w:type="dxa" w:w="1022"/>
+            <w:vAlign w:val="center"/>
+          </w:tcPr>
+          <w:p>
+            <w:pPr>
+              <w:spacing w:after="0"/>
+            </w:pPr>
+            <w:r>
+              <w:t>d698dbf</w:t>
+            </w:r>
+          </w:p>
+        </w:tc>
+        <w:tc>
+          <w:tcPr>
+            <w:tcW w:type="dxa" w:w="1022"/>
+            <w:vAlign w:val="center"/>
+          </w:tcPr>
+          <w:p>
+            <w:pPr>
+              <w:spacing w:after="0"/>
+            </w:pPr>
+            <w:r>
+              <w:t>Codex; Kyle review</w:t>
+            </w:r>
+          </w:p>
+        </w:tc>
+        <w:tc>
+          <w:tcPr>
+            <w:tcW w:type="dxa" w:w="1022"/>
+            <w:vAlign w:val="center"/>
+          </w:tcPr>
+          <w:p>
+            <w:pPr>
+              <w:spacing w:after="0"/>
+            </w:pPr>
+            <w:r>
+              <w:t>Pending</w:t>
+            </w:r>
+          </w:p>
+        </w:tc>
+      </w:tr>
+      <w:tr>
+        <w:trPr>
+          <w:cantSplit/>
+        </w:trPr>
+        <w:tc>
+          <w:tcPr>
+            <w:tcW w:type="dxa" w:w="1022"/>
+            <w:vAlign w:val="center"/>
+          </w:tcPr>
+          <w:p>
+            <w:pPr>
+              <w:spacing w:after="0"/>
+            </w:pPr>
+            <w:r>
+              <w:t>2026-10-01</w:t>
+            </w:r>
+          </w:p>
+        </w:tc>
+        <w:tc>
+          <w:tcPr>
+            <w:tcW w:type="dxa" w:w="1022"/>
+            <w:vAlign w:val="center"/>
+          </w:tcPr>
+          <w:p>
+            <w:pPr>
+              <w:spacing w:after="0"/>
+            </w:pPr>
+            <w:r>
+              <w:t>S4</w:t>
+            </w:r>
+          </w:p>
+        </w:tc>
+        <w:tc>
+          <w:tcPr>
+            <w:tcW w:type="dxa" w:w="1022"/>
+            <w:vAlign w:val="center"/>
+          </w:tcPr>
+          <w:p>
+            <w:pPr>
+              <w:spacing w:after="0"/>
+            </w:pPr>
+            <w:r>
+              <w:t>Bound sample storage</w:t>
+            </w:r>
+          </w:p>
+        </w:tc>
+        <w:tc>
+          <w:tcPr>
+            <w:tcW w:type="dxa" w:w="1022"/>
+            <w:vAlign w:val="center"/>
+          </w:tcPr>
+          <w:p>
+            <w:pPr>
+              <w:spacing w:after="0"/>
+            </w:pPr>
+            <w:r>
+              <w:t>Less list storage</w:t>
+            </w:r>
+          </w:p>
+        </w:tc>
+        <w:tc>
+          <w:tcPr>
+            <w:tcW w:type="dxa" w:w="1022"/>
+            <w:vAlign w:val="center"/>
+          </w:tcPr>
+          <w:p>
+            <w:pPr>
+              <w:spacing w:after="0"/>
+            </w:pPr>
+            <w:r>
+              <w:t>E3, E4, E7, E9</w:t>
+            </w:r>
+          </w:p>
+        </w:tc>
+        <w:tc>
+          <w:tcPr>
+            <w:tcW w:type="dxa" w:w="1022"/>
+            <w:vAlign w:val="center"/>
+          </w:tcPr>
+          <w:p>
+            <w:pPr>
+              <w:spacing w:after="0"/>
+            </w:pPr>
+            <w:r>
+              <w:t>S4</w:t>
+            </w:r>
+          </w:p>
+        </w:tc>
+        <w:tc>
+          <w:tcPr>
+            <w:tcW w:type="dxa" w:w="1022"/>
+            <w:vAlign w:val="center"/>
+          </w:tcPr>
+          <w:p>
+            <w:pPr>
+              <w:spacing w:after="0"/>
+            </w:pPr>
+            <w:r>
+              <w:t>31 passed</w:t>
+            </w:r>
+          </w:p>
+        </w:tc>
+        <w:tc>
+          <w:tcPr>
+            <w:tcW w:type="dxa" w:w="1022"/>
+            <w:vAlign w:val="center"/>
+          </w:tcPr>
+          <w:p>
+            <w:pPr>
+              <w:spacing w:after="0"/>
+            </w:pPr>
+            <w:r>
+              <w:t>967d8c9</w:t>
+            </w:r>
+          </w:p>
+        </w:tc>
+        <w:tc>
+          <w:tcPr>
+            <w:tcW w:type="dxa" w:w="1022"/>
+            <w:vAlign w:val="center"/>
+          </w:tcPr>
+          <w:p>
+            <w:pPr>
+              <w:spacing w:after="0"/>
+            </w:pPr>
+            <w:r>
+              <w:t>Codex; Kyle review</w:t>
+            </w:r>
+          </w:p>
+        </w:tc>
+        <w:tc>
+          <w:tcPr>
+            <w:tcW w:type="dxa" w:w="1022"/>
+            <w:vAlign w:val="center"/>
+          </w:tcPr>
+          <w:p>
+            <w:pPr>
+              <w:spacing w:after="0"/>
+            </w:pPr>
+            <w:r>
+              <w:t>Pending</w:t>
+            </w:r>
+          </w:p>
+        </w:tc>
+      </w:tr>
+      <w:tr>
+        <w:trPr>
+          <w:cantSplit/>
+        </w:trPr>
+        <w:tc>
+          <w:tcPr>
+            <w:tcW w:type="dxa" w:w="1022"/>
+            <w:vAlign w:val="center"/>
+          </w:tcPr>
+          <w:p>
+            <w:pPr>
+              <w:spacing w:after="0"/>
+            </w:pPr>
+            <w:r>
+              <w:t>2026-10-01</w:t>
+            </w:r>
+          </w:p>
+        </w:tc>
+        <w:tc>
+          <w:tcPr>
+            <w:tcW w:type="dxa" w:w="1022"/>
+            <w:vAlign w:val="center"/>
+          </w:tcPr>
+          <w:p>
+            <w:pPr>
+              <w:spacing w:after="0"/>
+            </w:pPr>
+            <w:r>
+              <w:t>S5</w:t>
+            </w:r>
+          </w:p>
+        </w:tc>
+        <w:tc>
+          <w:tcPr>
+            <w:tcW w:type="dxa" w:w="1022"/>
+            <w:vAlign w:val="center"/>
+          </w:tcPr>
+          <w:p>
+            <w:pPr>
+              <w:spacing w:after="0"/>
+            </w:pPr>
+            <w:r>
+              <w:t>CLI contract checks</w:t>
+            </w:r>
+          </w:p>
+        </w:tc>
+        <w:tc>
+          <w:tcPr>
+            <w:tcW w:type="dxa" w:w="1022"/>
+            <w:vAlign w:val="center"/>
+          </w:tcPr>
+          <w:p>
+            <w:pPr>
+              <w:spacing w:after="0"/>
+            </w:pPr>
+            <w:r>
+              <w:t>Stream verification</w:t>
+            </w:r>
+          </w:p>
+        </w:tc>
+        <w:tc>
+          <w:tcPr>
+            <w:tcW w:type="dxa" w:w="1022"/>
+            <w:vAlign w:val="center"/>
+          </w:tcPr>
+          <w:p>
+            <w:pPr>
+              <w:spacing w:after="0"/>
+            </w:pPr>
+            <w:r>
+              <w:t>E1, E9</w:t>
+            </w:r>
+          </w:p>
+        </w:tc>
+        <w:tc>
+          <w:tcPr>
+            <w:tcW w:type="dxa" w:w="1022"/>
+            <w:vAlign w:val="center"/>
+          </w:tcPr>
+          <w:p>
+            <w:pPr>
+              <w:spacing w:after="0"/>
+            </w:pPr>
+            <w:r>
+              <w:t>S5</w:t>
+            </w:r>
+          </w:p>
+        </w:tc>
+        <w:tc>
+          <w:tcPr>
+            <w:tcW w:type="dxa" w:w="1022"/>
+            <w:vAlign w:val="center"/>
+          </w:tcPr>
+          <w:p>
+            <w:pPr>
+              <w:spacing w:after="0"/>
+            </w:pPr>
+            <w:r>
+              <w:t>36 passed</w:t>
+            </w:r>
+          </w:p>
+        </w:tc>
+        <w:tc>
+          <w:tcPr>
+            <w:tcW w:type="dxa" w:w="1022"/>
+            <w:vAlign w:val="center"/>
+          </w:tcPr>
+          <w:p>
+            <w:pPr>
+              <w:spacing w:after="0"/>
+            </w:pPr>
+            <w:r>
+              <w:t>8b78cd0</w:t>
+            </w:r>
+          </w:p>
+        </w:tc>
+        <w:tc>
+          <w:tcPr>
+            <w:tcW w:type="dxa" w:w="1022"/>
+            <w:vAlign w:val="center"/>
+          </w:tcPr>
+          <w:p>
+            <w:pPr>
+              <w:spacing w:after="0"/>
+            </w:pPr>
+            <w:r>
+              <w:t>Codex; Kyle review</w:t>
+            </w:r>
+          </w:p>
+        </w:tc>
+        <w:tc>
+          <w:tcPr>
+            <w:tcW w:type="dxa" w:w="1022"/>
+            <w:vAlign w:val="center"/>
+          </w:tcPr>
+          <w:p>
+            <w:pPr>
+              <w:spacing w:after="0"/>
+            </w:pPr>
+            <w:r>
+              <w:t>Pending</w:t>
+            </w:r>
+          </w:p>
+        </w:tc>
+      </w:tr>
+      <w:tr>
+        <w:trPr>
+          <w:cantSplit/>
+        </w:trPr>
+        <w:tc>
+          <w:tcPr>
+            <w:tcW w:type="dxa" w:w="1022"/>
+            <w:vAlign w:val="center"/>
+          </w:tcPr>
+          <w:p>
+            <w:pPr>
+              <w:spacing w:after="0"/>
+            </w:pPr>
+            <w:r>
+              <w:t>2026-10-01</w:t>
+            </w:r>
+          </w:p>
+        </w:tc>
+        <w:tc>
+          <w:tcPr>
+            <w:tcW w:type="dxa" w:w="1022"/>
+            <w:vAlign w:val="center"/>
+          </w:tcPr>
+          <w:p>
+            <w:pPr>
+              <w:spacing w:after="0"/>
+            </w:pPr>
+            <w:r>
+              <w:t>S6</w:t>
+            </w:r>
+          </w:p>
+        </w:tc>
+        <w:tc>
+          <w:tcPr>
+            <w:tcW w:type="dxa" w:w="1022"/>
+            <w:vAlign w:val="center"/>
+          </w:tcPr>
+          <w:p>
+            <w:pPr>
+              <w:spacing w:after="0"/>
+            </w:pPr>
+            <w:r>
+              <w:t>Demo and handoff</w:t>
+            </w:r>
+          </w:p>
+        </w:tc>
+        <w:tc>
+          <w:tcPr>
+            <w:tcW w:type="dxa" w:w="1022"/>
+            <w:vAlign w:val="center"/>
+          </w:tcPr>
+          <w:p>
+            <w:pPr>
+              <w:spacing w:after="0"/>
+            </w:pPr>
+            <w:r>
+              <w:t>Repeatable review</w:t>
+            </w:r>
+          </w:p>
+        </w:tc>
+        <w:tc>
+          <w:tcPr>
+            <w:tcW w:type="dxa" w:w="1022"/>
+            <w:vAlign w:val="center"/>
+          </w:tcPr>
+          <w:p>
+            <w:pPr>
+              <w:spacing w:after="0"/>
+            </w:pPr>
+            <w:r>
+              <w:t>E2, E4, E5, E7, E10; form</w:t>
+            </w:r>
+          </w:p>
+        </w:tc>
+        <w:tc>
+          <w:tcPr>
+            <w:tcW w:type="dxa" w:w="1022"/>
+            <w:vAlign w:val="center"/>
+          </w:tcPr>
+          <w:p>
+            <w:pPr>
+              <w:spacing w:after="0"/>
+            </w:pPr>
+            <w:r>
+              <w:t>S6</w:t>
+            </w:r>
+          </w:p>
+        </w:tc>
+        <w:tc>
+          <w:tcPr>
+            <w:tcW w:type="dxa" w:w="1022"/>
+            <w:vAlign w:val="center"/>
+          </w:tcPr>
+          <w:p>
+            <w:pPr>
+              <w:spacing w:after="0"/>
+            </w:pPr>
+            <w:r>
+              <w:t>Demo; hash; QA note</w:t>
+            </w:r>
+          </w:p>
+        </w:tc>
+        <w:tc>
+          <w:tcPr>
+            <w:tcW w:type="dxa" w:w="1022"/>
+            <w:vAlign w:val="center"/>
+          </w:tcPr>
+          <w:p>
+            <w:pPr>
+              <w:spacing w:after="0"/>
+            </w:pPr>
+            <w:r>
+              <w:t>docs(static): update demo and evidence handoff</w:t>
+            </w:r>
+          </w:p>
+        </w:tc>
+        <w:tc>
+          <w:tcPr>
+            <w:tcW w:type="dxa" w:w="1022"/>
+            <w:vAlign w:val="center"/>
+          </w:tcPr>
+          <w:p>
+            <w:pPr>
+              <w:spacing w:after="0"/>
+            </w:pPr>
+            <w:r>
+              <w:t>Codex; Kyle review</w:t>
+            </w:r>
+          </w:p>
+        </w:tc>
+        <w:tc>
+          <w:tcPr>
+            <w:tcW w:type="dxa" w:w="1022"/>
+            <w:vAlign w:val="center"/>
+          </w:tcPr>
+          <w:p>
+            <w:pPr>
+              <w:spacing w:after="0"/>
+            </w:pPr>
+            <w:r>
+              <w:t>Pending</w:t>
             </w:r>
           </w:p>
         </w:tc>
@@ -2189,7 +2864,7 @@
                 <w:b w:val="0"/>
                 <w:sz w:val="17"/>
               </w:rPr>
-              <w:t>PE file path</w:t>
+              <w:t>PE path; --max-bytes</w:t>
             </w:r>
           </w:p>
         </w:tc>
@@ -2227,7 +2902,7 @@
                 <w:b w:val="0"/>
                 <w:sz w:val="17"/>
               </w:rPr>
-              <w:t>M1</w:t>
+              <w:t>50 MiB default</w:t>
             </w:r>
           </w:p>
         </w:tc>
@@ -2384,7 +3059,7 @@
                 <w:b w:val="0"/>
                 <w:sz w:val="17"/>
               </w:rPr>
-              <w:t>1.0.0</w:t>
+              <w:t>1.2.0</w:t>
             </w:r>
           </w:p>
         </w:tc>
@@ -2660,7 +3335,7 @@
                 <w:b w:val="0"/>
                 <w:sz w:val="17"/>
               </w:rPr>
-              <w:t>18 test results</w:t>
+              <w:t>36 test results</w:t>
             </w:r>
           </w:p>
         </w:tc>
@@ -2698,7 +3373,7 @@
                 <w:b w:val="0"/>
                 <w:sz w:val="17"/>
               </w:rPr>
-              <w:t>M3</w:t>
+              <w:t>S5</w:t>
             </w:r>
           </w:p>
         </w:tc>
@@ -2855,7 +3530,7 @@
                 <w:b w:val="0"/>
                 <w:sz w:val="17"/>
               </w:rPr>
-              <w:t>1.0.0</w:t>
+              <w:t>1.2.0</w:t>
             </w:r>
           </w:p>
         </w:tc>
@@ -2993,7 +3668,7 @@
                 <w:b w:val="0"/>
                 <w:sz w:val="17"/>
               </w:rPr>
-              <w:t>E10 design</w:t>
+              <w:t>E4/E10 handoff</w:t>
             </w:r>
           </w:p>
         </w:tc>
@@ -4937,7 +5612,7 @@
                 <w:b w:val="0"/>
                 <w:sz w:val="17"/>
               </w:rPr>
-              <w:t>SHA-256, byte size, PE metadata, section entropy, imports/APIs, and printable strings.</w:t>
+              <w:t>SHA-256, captured byte size, PE headers, section entropy and permissions, parser warnings, ordinary and delay imports, and printable strings.</w:t>
             </w:r>
           </w:p>
         </w:tc>
@@ -4983,7 +5658,7 @@
                 <w:b w:val="0"/>
                 <w:sz w:val="17"/>
               </w:rPr>
-              <w:t>hashlib and byte reads; pefile parses headers, sections, and ordinary imports. Files are not launched.</w:t>
+              <w:t>One read of at most max_bytes + 1; reject oversized input. Hash, size, strings, and pefile parsing use captured bytes. PE resources close on success/failure. No submitted file is launched.</w:t>
             </w:r>
           </w:p>
         </w:tc>
@@ -5029,7 +5704,7 @@
                 <w:b w:val="0"/>
                 <w:sz w:val="17"/>
               </w:rPr>
-              <w:t>Version 1.0.0 JSON: strings, integers, numbers, booleans, arrays, objects, and nullable UTC timestamp. All fields required. E6 schema; E7 field reference.</w:t>
+              <w:t>Version 1.2.0 JSON; E6 schema and E7 field reference. Additive evidence requires strict consumers to update schemas. Existing names, types, and meanings retained.</w:t>
             </w:r>
           </w:p>
         </w:tc>
@@ -5075,7 +5750,7 @@
                 <w:b w:val="0"/>
                 <w:sz w:val="17"/>
               </w:rPr>
-              <w:t>Missing/invalid input: error JSON on stderr, exit 1. No exposed ordinary imports: empty arrays and zero counts. Zero or unconvertible timestamp: null. Unknown architecture/format: Unknown (0x...).</w:t>
+              <w:t>Missing, empty, malformed, or oversized input: stderr error, empty stdout, exit 1. Absent ordinary/delay tables: empty dlls/apis. No warnings: []. Zero/unconvertible timestamp: null.</w:t>
             </w:r>
           </w:p>
         </w:tc>
@@ -5121,7 +5796,7 @@
                 <w:b w:val="0"/>
                 <w:sz w:val="17"/>
               </w:rPr>
-              <w:t>Entropy rounded to four decimals; imports/entropy are observations only. Timestamp is untrusted metadata. Strings: ASCII first, then printable-ASCII UTF-16LE; deduplicated; sample_limit 200 and explicit truncated flag. ML feature-vector transformation is still required.</w:t>
+              <w:t>Readable/writable/executable booleans retain raw characteristics. Delay imports use DLL!function or DLL!ordinal:N, separate from ordinary summary counts. Strings: ASCII then ASCII-in-UTF-16LE; exact unique count; sample_limit 200; truncated means omitted whole values. Samples remain full length.</w:t>
             </w:r>
           </w:p>
         </w:tc>
@@ -5213,7 +5888,7 @@
                 <w:b w:val="0"/>
                 <w:sz w:val="17"/>
               </w:rPr>
-              <w:t>T01-T18 in E1/E2/E9. Fresh signed notepad.exe report passed schema, date-time, and count checks; its SHA-256 matched PowerShell. See E2/E5.</w:t>
+              <w:t>Baseline 18 tests; S5 complete suite 36 passed. Synthetic named/ordinal import tables and absent evidence verified. Signed System32 notepad.exe report passed file/stdin validation and SHA-256 matched Get-FileHash. E2/E4.</w:t>
             </w:r>
           </w:p>
         </w:tc>
@@ -6369,6 +7044,477 @@
                 <w:sz w:val="17"/>
               </w:rPr>
               <w:t>Kyle review pending</w:t>
+            </w:r>
+          </w:p>
+        </w:tc>
+      </w:tr>
+      <w:tr>
+        <w:trPr>
+          <w:cantSplit/>
+        </w:trPr>
+        <w:tc>
+          <w:tcPr>
+            <w:tcW w:type="dxa" w:w="1278"/>
+            <w:vAlign w:val="center"/>
+          </w:tcPr>
+          <w:p>
+            <w:pPr>
+              <w:spacing w:after="0"/>
+            </w:pPr>
+            <w:r>
+              <w:rPr>
+                <w:rFonts w:ascii="Aptos" w:hAnsi="Aptos"/>
+                <w:b w:val="0"/>
+                <w:sz w:val="17"/>
+              </w:rPr>
+              <w:t>2026-10-01</w:t>
+            </w:r>
+          </w:p>
+        </w:tc>
+        <w:tc>
+          <w:tcPr>
+            <w:tcW w:type="dxa" w:w="1278"/>
+            <w:vAlign w:val="center"/>
+          </w:tcPr>
+          <w:p>
+            <w:pPr>
+              <w:spacing w:after="0"/>
+            </w:pPr>
+            <w:r>
+              <w:rPr>
+                <w:rFonts w:ascii="Aptos" w:hAnsi="Aptos"/>
+                <w:b w:val="0"/>
+                <w:sz w:val="17"/>
+              </w:rPr>
+              <w:t>D07</w:t>
+            </w:r>
+          </w:p>
+        </w:tc>
+        <w:tc>
+          <w:tcPr>
+            <w:tcW w:type="dxa" w:w="1278"/>
+            <w:vAlign w:val="center"/>
+          </w:tcPr>
+          <w:p>
+            <w:pPr>
+              <w:spacing w:after="0"/>
+            </w:pPr>
+            <w:r>
+              <w:rPr>
+                <w:rFonts w:ascii="Aptos" w:hAnsi="Aptos"/>
+                <w:b w:val="0"/>
+                <w:sz w:val="17"/>
+              </w:rPr>
+              <w:t>Version policy?</w:t>
+            </w:r>
+          </w:p>
+        </w:tc>
+        <w:tc>
+          <w:tcPr>
+            <w:tcW w:type="dxa" w:w="1278"/>
+            <w:vAlign w:val="center"/>
+          </w:tcPr>
+          <w:p>
+            <w:pPr>
+              <w:spacing w:after="0"/>
+            </w:pPr>
+            <w:r>
+              <w:rPr>
+                <w:rFonts w:ascii="Aptos" w:hAnsi="Aptos"/>
+                <w:b w:val="0"/>
+                <w:sz w:val="17"/>
+              </w:rPr>
+              <w:t>Implicit / explicit</w:t>
+            </w:r>
+          </w:p>
+        </w:tc>
+        <w:tc>
+          <w:tcPr>
+            <w:tcW w:type="dxa" w:w="1278"/>
+            <w:vAlign w:val="center"/>
+          </w:tcPr>
+          <w:p>
+            <w:pPr>
+              <w:spacing w:after="0"/>
+            </w:pPr>
+            <w:r>
+              <w:rPr>
+                <w:rFonts w:ascii="Aptos" w:hAnsi="Aptos"/>
+                <w:b w:val="0"/>
+                <w:sz w:val="17"/>
+              </w:rPr>
+              <w:t>Minor additions; major semantic changes</w:t>
+            </w:r>
+          </w:p>
+        </w:tc>
+        <w:tc>
+          <w:tcPr>
+            <w:tcW w:type="dxa" w:w="1278"/>
+            <w:vAlign w:val="center"/>
+          </w:tcPr>
+          <w:p>
+            <w:pPr>
+              <w:spacing w:after="0"/>
+            </w:pPr>
+            <w:r>
+              <w:rPr>
+                <w:rFonts w:ascii="Aptos" w:hAnsi="Aptos"/>
+                <w:b w:val="0"/>
+                <w:sz w:val="17"/>
+              </w:rPr>
+              <w:t>Consumer contract</w:t>
+            </w:r>
+          </w:p>
+        </w:tc>
+        <w:tc>
+          <w:tcPr>
+            <w:tcW w:type="dxa" w:w="1278"/>
+            <w:vAlign w:val="center"/>
+          </w:tcPr>
+          <w:p>
+            <w:pPr>
+              <w:spacing w:after="0"/>
+            </w:pPr>
+            <w:r>
+              <w:rPr>
+                <w:rFonts w:ascii="Aptos" w:hAnsi="Aptos"/>
+                <w:b w:val="0"/>
+                <w:sz w:val="17"/>
+              </w:rPr>
+              <w:t>Strict schemas must update</w:t>
+            </w:r>
+          </w:p>
+        </w:tc>
+        <w:tc>
+          <w:tcPr>
+            <w:tcW w:type="dxa" w:w="1278"/>
+            <w:vAlign w:val="center"/>
+          </w:tcPr>
+          <w:p>
+            <w:pPr>
+              <w:spacing w:after="0"/>
+            </w:pPr>
+            <w:r>
+              <w:rPr>
+                <w:rFonts w:ascii="Aptos" w:hAnsi="Aptos"/>
+                <w:b w:val="0"/>
+                <w:sz w:val="17"/>
+              </w:rPr>
+              <w:t>Kyle review pending</w:t>
+            </w:r>
+          </w:p>
+        </w:tc>
+      </w:tr>
+      <w:tr>
+        <w:trPr>
+          <w:cantSplit/>
+        </w:trPr>
+        <w:tc>
+          <w:tcPr>
+            <w:tcW w:type="dxa" w:w="1278"/>
+            <w:vAlign w:val="center"/>
+          </w:tcPr>
+          <w:p>
+            <w:pPr>
+              <w:spacing w:after="0"/>
+            </w:pPr>
+            <w:r>
+              <w:rPr>
+                <w:rFonts w:ascii="Aptos" w:hAnsi="Aptos"/>
+                <w:b w:val="0"/>
+                <w:sz w:val="17"/>
+              </w:rPr>
+              <w:t>2026-10-01</w:t>
+            </w:r>
+          </w:p>
+        </w:tc>
+        <w:tc>
+          <w:tcPr>
+            <w:tcW w:type="dxa" w:w="1278"/>
+            <w:vAlign w:val="center"/>
+          </w:tcPr>
+          <w:p>
+            <w:pPr>
+              <w:spacing w:after="0"/>
+            </w:pPr>
+            <w:r>
+              <w:rPr>
+                <w:rFonts w:ascii="Aptos" w:hAnsi="Aptos"/>
+                <w:b w:val="0"/>
+                <w:sz w:val="17"/>
+              </w:rPr>
+              <w:t>D08</w:t>
+            </w:r>
+          </w:p>
+        </w:tc>
+        <w:tc>
+          <w:tcPr>
+            <w:tcW w:type="dxa" w:w="1278"/>
+            <w:vAlign w:val="center"/>
+          </w:tcPr>
+          <w:p>
+            <w:pPr>
+              <w:spacing w:after="0"/>
+            </w:pPr>
+            <w:r>
+              <w:rPr>
+                <w:rFonts w:ascii="Aptos" w:hAnsi="Aptos"/>
+                <w:b w:val="0"/>
+                <w:sz w:val="17"/>
+              </w:rPr>
+              <w:t>500-char sample cap?</w:t>
+            </w:r>
+          </w:p>
+        </w:tc>
+        <w:tc>
+          <w:tcPr>
+            <w:tcW w:type="dxa" w:w="1278"/>
+            <w:vAlign w:val="center"/>
+          </w:tcPr>
+          <w:p>
+            <w:pPr>
+              <w:spacing w:after="0"/>
+            </w:pPr>
+            <w:r>
+              <w:rPr>
+                <w:rFonts w:ascii="Aptos" w:hAnsi="Aptos"/>
+                <w:b w:val="0"/>
+                <w:sz w:val="17"/>
+              </w:rPr>
+              <w:t>Cap / full values</w:t>
+            </w:r>
+          </w:p>
+        </w:tc>
+        <w:tc>
+          <w:tcPr>
+            <w:tcW w:type="dxa" w:w="1278"/>
+            <w:vAlign w:val="center"/>
+          </w:tcPr>
+          <w:p>
+            <w:pPr>
+              <w:spacing w:after="0"/>
+            </w:pPr>
+            <w:r>
+              <w:rPr>
+                <w:rFonts w:ascii="Aptos" w:hAnsi="Aptos"/>
+                <w:b w:val="0"/>
+                <w:sz w:val="17"/>
+              </w:rPr>
+              <w:t>Defer cap; retain full strings</w:t>
+            </w:r>
+          </w:p>
+        </w:tc>
+        <w:tc>
+          <w:tcPr>
+            <w:tcW w:type="dxa" w:w="1278"/>
+            <w:vAlign w:val="center"/>
+          </w:tcPr>
+          <w:p>
+            <w:pPr>
+              <w:spacing w:after="0"/>
+            </w:pPr>
+            <w:r>
+              <w:rPr>
+                <w:rFonts w:ascii="Aptos" w:hAnsi="Aptos"/>
+                <w:b w:val="0"/>
+                <w:sz w:val="17"/>
+              </w:rPr>
+              <w:t>Preserve semantics</w:t>
+            </w:r>
+          </w:p>
+        </w:tc>
+        <w:tc>
+          <w:tcPr>
+            <w:tcW w:type="dxa" w:w="1278"/>
+            <w:vAlign w:val="center"/>
+          </w:tcPr>
+          <w:p>
+            <w:pPr>
+              <w:spacing w:after="0"/>
+            </w:pPr>
+            <w:r>
+              <w:rPr>
+                <w:rFonts w:ascii="Aptos" w:hAnsi="Aptos"/>
+                <w:b w:val="0"/>
+                <w:sz w:val="17"/>
+              </w:rPr>
+              <w:t>Long values and exact set still cost memory</w:t>
+            </w:r>
+          </w:p>
+        </w:tc>
+        <w:tc>
+          <w:tcPr>
+            <w:tcW w:type="dxa" w:w="1278"/>
+            <w:vAlign w:val="center"/>
+          </w:tcPr>
+          <w:p>
+            <w:pPr>
+              <w:spacing w:after="0"/>
+            </w:pPr>
+            <w:r>
+              <w:rPr>
+                <w:rFonts w:ascii="Aptos" w:hAnsi="Aptos"/>
+                <w:b w:val="0"/>
+                <w:sz w:val="17"/>
+              </w:rPr>
+              <w:t>Kyle direction in task</w:t>
+            </w:r>
+          </w:p>
+        </w:tc>
+      </w:tr>
+      <w:tr>
+        <w:trPr>
+          <w:cantSplit/>
+        </w:trPr>
+        <w:tc>
+          <w:tcPr>
+            <w:tcW w:type="dxa" w:w="1278"/>
+            <w:vAlign w:val="center"/>
+          </w:tcPr>
+          <w:p>
+            <w:pPr>
+              <w:spacing w:after="0"/>
+            </w:pPr>
+            <w:r>
+              <w:rPr>
+                <w:rFonts w:ascii="Aptos" w:hAnsi="Aptos"/>
+                <w:b w:val="0"/>
+                <w:sz w:val="17"/>
+              </w:rPr>
+              <w:t>2026-10-01</w:t>
+            </w:r>
+          </w:p>
+        </w:tc>
+        <w:tc>
+          <w:tcPr>
+            <w:tcW w:type="dxa" w:w="1278"/>
+            <w:vAlign w:val="center"/>
+          </w:tcPr>
+          <w:p>
+            <w:pPr>
+              <w:spacing w:after="0"/>
+            </w:pPr>
+            <w:r>
+              <w:rPr>
+                <w:rFonts w:ascii="Aptos" w:hAnsi="Aptos"/>
+                <w:b w:val="0"/>
+                <w:sz w:val="17"/>
+              </w:rPr>
+              <w:t>D09</w:t>
+            </w:r>
+          </w:p>
+        </w:tc>
+        <w:tc>
+          <w:tcPr>
+            <w:tcW w:type="dxa" w:w="1278"/>
+            <w:vAlign w:val="center"/>
+          </w:tcPr>
+          <w:p>
+            <w:pPr>
+              <w:spacing w:after="0"/>
+            </w:pPr>
+            <w:r>
+              <w:rPr>
+                <w:rFonts w:ascii="Aptos" w:hAnsi="Aptos"/>
+                <w:b w:val="0"/>
+                <w:sz w:val="17"/>
+              </w:rPr>
+              <w:t>Demo documentation?</w:t>
+            </w:r>
+          </w:p>
+        </w:tc>
+        <w:tc>
+          <w:tcPr>
+            <w:tcW w:type="dxa" w:w="1278"/>
+            <w:vAlign w:val="center"/>
+          </w:tcPr>
+          <w:p>
+            <w:pPr>
+              <w:spacing w:after="0"/>
+            </w:pPr>
+            <w:r>
+              <w:rPr>
+                <w:rFonts w:ascii="Aptos" w:hAnsi="Aptos"/>
+                <w:b w:val="0"/>
+                <w:sz w:val="17"/>
+              </w:rPr>
+              <w:t>New / existing</w:t>
+            </w:r>
+          </w:p>
+        </w:tc>
+        <w:tc>
+          <w:tcPr>
+            <w:tcW w:type="dxa" w:w="1278"/>
+            <w:vAlign w:val="center"/>
+          </w:tcPr>
+          <w:p>
+            <w:pPr>
+              <w:spacing w:after="0"/>
+            </w:pPr>
+            <w:r>
+              <w:rPr>
+                <w:rFonts w:ascii="Aptos" w:hAnsi="Aptos"/>
+                <w:b w:val="0"/>
+                <w:sz w:val="17"/>
+              </w:rPr>
+              <w:t>README + contract + this form</w:t>
+            </w:r>
+          </w:p>
+        </w:tc>
+        <w:tc>
+          <w:tcPr>
+            <w:tcW w:type="dxa" w:w="1278"/>
+            <w:vAlign w:val="center"/>
+          </w:tcPr>
+          <w:p>
+            <w:pPr>
+              <w:spacing w:after="0"/>
+            </w:pPr>
+            <w:r>
+              <w:rPr>
+                <w:rFonts w:ascii="Aptos" w:hAnsi="Aptos"/>
+                <w:b w:val="0"/>
+                <w:sz w:val="17"/>
+              </w:rPr>
+              <w:t>One maintained guide</w:t>
+            </w:r>
+          </w:p>
+        </w:tc>
+        <w:tc>
+          <w:tcPr>
+            <w:tcW w:type="dxa" w:w="1278"/>
+            <w:vAlign w:val="center"/>
+          </w:tcPr>
+          <w:p>
+            <w:pPr>
+              <w:spacing w:after="0"/>
+            </w:pPr>
+            <w:r>
+              <w:rPr>
+                <w:rFonts w:ascii="Aptos" w:hAnsi="Aptos"/>
+                <w:b w:val="0"/>
+                <w:sz w:val="17"/>
+              </w:rPr>
+              <w:t>Repair obsolete links</w:t>
+            </w:r>
+          </w:p>
+        </w:tc>
+        <w:tc>
+          <w:tcPr>
+            <w:tcW w:type="dxa" w:w="1278"/>
+            <w:vAlign w:val="center"/>
+          </w:tcPr>
+          <w:p>
+            <w:pPr>
+              <w:spacing w:after="0"/>
+            </w:pPr>
+            <w:r>
+              <w:rPr>
+                <w:rFonts w:ascii="Aptos" w:hAnsi="Aptos"/>
+                <w:b w:val="0"/>
+                <w:sz w:val="17"/>
+              </w:rPr>
+              <w:t>Task scope</w:t>
             </w:r>
           </w:p>
         </w:tc>
@@ -10848,6 +11994,1203 @@
           </w:p>
         </w:tc>
       </w:tr>
+      <w:tr>
+        <w:trPr>
+          <w:cantSplit/>
+        </w:trPr>
+        <w:tc>
+          <w:tcPr>
+            <w:tcW w:type="dxa" w:w="1136"/>
+            <w:vAlign w:val="center"/>
+          </w:tcPr>
+          <w:p>
+            <w:pPr>
+              <w:spacing w:after="0"/>
+            </w:pPr>
+            <w:r>
+              <w:rPr>
+                <w:rFonts w:ascii="Aptos" w:hAnsi="Aptos"/>
+                <w:b w:val="0"/>
+                <w:sz w:val="17"/>
+              </w:rPr>
+              <w:t>S1</w:t>
+            </w:r>
+          </w:p>
+        </w:tc>
+        <w:tc>
+          <w:tcPr>
+            <w:tcW w:type="dxa" w:w="1136"/>
+            <w:vAlign w:val="center"/>
+          </w:tcPr>
+          <w:p>
+            <w:pPr>
+              <w:spacing w:after="0"/>
+            </w:pPr>
+            <w:r>
+              <w:rPr>
+                <w:rFonts w:ascii="Aptos" w:hAnsi="Aptos"/>
+                <w:b w:val="0"/>
+                <w:sz w:val="17"/>
+              </w:rPr>
+              <w:t>Bounded capture/cleanup</w:t>
+            </w:r>
+          </w:p>
+        </w:tc>
+        <w:tc>
+          <w:tcPr>
+            <w:tcW w:type="dxa" w:w="1136"/>
+            <w:vAlign w:val="center"/>
+          </w:tcPr>
+          <w:p>
+            <w:pPr>
+              <w:spacing w:after="0"/>
+            </w:pPr>
+            <w:r>
+              <w:rPr>
+                <w:rFonts w:ascii="Aptos" w:hAnsi="Aptos"/>
+                <w:b w:val="0"/>
+                <w:sz w:val="17"/>
+              </w:rPr>
+              <w:t>unittest</w:t>
+            </w:r>
+          </w:p>
+        </w:tc>
+        <w:tc>
+          <w:tcPr>
+            <w:tcW w:type="dxa" w:w="1136"/>
+            <w:vAlign w:val="center"/>
+          </w:tcPr>
+          <w:p>
+            <w:pPr>
+              <w:spacing w:after="0"/>
+            </w:pPr>
+            <w:r>
+              <w:rPr>
+                <w:rFonts w:ascii="Aptos" w:hAnsi="Aptos"/>
+                <w:b w:val="0"/>
+                <w:sz w:val="17"/>
+              </w:rPr>
+              <w:t>Inert fixtures</w:t>
+            </w:r>
+          </w:p>
+        </w:tc>
+        <w:tc>
+          <w:tcPr>
+            <w:tcW w:type="dxa" w:w="1136"/>
+            <w:vAlign w:val="center"/>
+          </w:tcPr>
+          <w:p>
+            <w:pPr>
+              <w:spacing w:after="0"/>
+            </w:pPr>
+            <w:r>
+              <w:rPr>
+                <w:rFonts w:ascii="Aptos" w:hAnsi="Aptos"/>
+                <w:b w:val="0"/>
+                <w:sz w:val="17"/>
+              </w:rPr>
+              <w:t>All pass</w:t>
+            </w:r>
+          </w:p>
+        </w:tc>
+        <w:tc>
+          <w:tcPr>
+            <w:tcW w:type="dxa" w:w="1136"/>
+            <w:vAlign w:val="center"/>
+          </w:tcPr>
+          <w:p>
+            <w:pPr>
+              <w:spacing w:after="0"/>
+            </w:pPr>
+            <w:r>
+              <w:rPr>
+                <w:rFonts w:ascii="Aptos" w:hAnsi="Aptos"/>
+                <w:b w:val="0"/>
+                <w:sz w:val="17"/>
+              </w:rPr>
+              <w:t>23 passed</w:t>
+            </w:r>
+          </w:p>
+        </w:tc>
+        <w:tc>
+          <w:tcPr>
+            <w:tcW w:type="dxa" w:w="1136"/>
+            <w:vAlign w:val="center"/>
+          </w:tcPr>
+          <w:p>
+            <w:pPr>
+              <w:spacing w:after="0"/>
+            </w:pPr>
+            <w:r>
+              <w:rPr>
+                <w:rFonts w:ascii="Aptos" w:hAnsi="Aptos"/>
+                <w:b w:val="0"/>
+                <w:sz w:val="17"/>
+              </w:rPr>
+              <w:t>Pass</w:t>
+            </w:r>
+          </w:p>
+        </w:tc>
+        <w:tc>
+          <w:tcPr>
+            <w:tcW w:type="dxa" w:w="1136"/>
+            <w:vAlign w:val="center"/>
+          </w:tcPr>
+          <w:p>
+            <w:pPr>
+              <w:spacing w:after="0"/>
+            </w:pPr>
+            <w:r>
+              <w:t>E1/E9; E2 record</w:t>
+            </w:r>
+          </w:p>
+        </w:tc>
+        <w:tc>
+          <w:tcPr>
+            <w:tcW w:type="dxa" w:w="1136"/>
+            <w:vAlign w:val="center"/>
+          </w:tcPr>
+          <w:p>
+            <w:pPr>
+              <w:spacing w:after="0"/>
+            </w:pPr>
+            <w:r>
+              <w:rPr>
+                <w:rFonts w:ascii="Aptos" w:hAnsi="Aptos"/>
+                <w:b w:val="0"/>
+                <w:sz w:val="17"/>
+              </w:rPr>
+              <w:t>2026-10-01</w:t>
+            </w:r>
+          </w:p>
+        </w:tc>
+      </w:tr>
+      <w:tr>
+        <w:trPr>
+          <w:cantSplit/>
+        </w:trPr>
+        <w:tc>
+          <w:tcPr>
+            <w:tcW w:type="dxa" w:w="1136"/>
+            <w:vAlign w:val="center"/>
+          </w:tcPr>
+          <w:p>
+            <w:pPr>
+              <w:spacing w:after="0"/>
+            </w:pPr>
+            <w:r>
+              <w:rPr>
+                <w:rFonts w:ascii="Aptos" w:hAnsi="Aptos"/>
+                <w:b w:val="0"/>
+                <w:sz w:val="17"/>
+              </w:rPr>
+              <w:t>S2</w:t>
+            </w:r>
+          </w:p>
+        </w:tc>
+        <w:tc>
+          <w:tcPr>
+            <w:tcW w:type="dxa" w:w="1136"/>
+            <w:vAlign w:val="center"/>
+          </w:tcPr>
+          <w:p>
+            <w:pPr>
+              <w:spacing w:after="0"/>
+            </w:pPr>
+            <w:r>
+              <w:rPr>
+                <w:rFonts w:ascii="Aptos" w:hAnsi="Aptos"/>
+                <w:b w:val="0"/>
+                <w:sz w:val="17"/>
+              </w:rPr>
+              <w:t>Flags/warnings</w:t>
+            </w:r>
+          </w:p>
+        </w:tc>
+        <w:tc>
+          <w:tcPr>
+            <w:tcW w:type="dxa" w:w="1136"/>
+            <w:vAlign w:val="center"/>
+          </w:tcPr>
+          <w:p>
+            <w:pPr>
+              <w:spacing w:after="0"/>
+            </w:pPr>
+            <w:r>
+              <w:rPr>
+                <w:rFonts w:ascii="Aptos" w:hAnsi="Aptos"/>
+                <w:b w:val="0"/>
+                <w:sz w:val="17"/>
+              </w:rPr>
+              <w:t>unittest</w:t>
+            </w:r>
+          </w:p>
+        </w:tc>
+        <w:tc>
+          <w:tcPr>
+            <w:tcW w:type="dxa" w:w="1136"/>
+            <w:vAlign w:val="center"/>
+          </w:tcPr>
+          <w:p>
+            <w:pPr>
+              <w:spacing w:after="0"/>
+            </w:pPr>
+            <w:r>
+              <w:rPr>
+                <w:rFonts w:ascii="Aptos" w:hAnsi="Aptos"/>
+                <w:b w:val="0"/>
+                <w:sz w:val="17"/>
+              </w:rPr>
+              <w:t>Inert fixtures</w:t>
+            </w:r>
+          </w:p>
+        </w:tc>
+        <w:tc>
+          <w:tcPr>
+            <w:tcW w:type="dxa" w:w="1136"/>
+            <w:vAlign w:val="center"/>
+          </w:tcPr>
+          <w:p>
+            <w:pPr>
+              <w:spacing w:after="0"/>
+            </w:pPr>
+            <w:r>
+              <w:rPr>
+                <w:rFonts w:ascii="Aptos" w:hAnsi="Aptos"/>
+                <w:b w:val="0"/>
+                <w:sz w:val="17"/>
+              </w:rPr>
+              <w:t>All pass</w:t>
+            </w:r>
+          </w:p>
+        </w:tc>
+        <w:tc>
+          <w:tcPr>
+            <w:tcW w:type="dxa" w:w="1136"/>
+            <w:vAlign w:val="center"/>
+          </w:tcPr>
+          <w:p>
+            <w:pPr>
+              <w:spacing w:after="0"/>
+            </w:pPr>
+            <w:r>
+              <w:rPr>
+                <w:rFonts w:ascii="Aptos" w:hAnsi="Aptos"/>
+                <w:b w:val="0"/>
+                <w:sz w:val="17"/>
+              </w:rPr>
+              <w:t>26 passed</w:t>
+            </w:r>
+          </w:p>
+        </w:tc>
+        <w:tc>
+          <w:tcPr>
+            <w:tcW w:type="dxa" w:w="1136"/>
+            <w:vAlign w:val="center"/>
+          </w:tcPr>
+          <w:p>
+            <w:pPr>
+              <w:spacing w:after="0"/>
+            </w:pPr>
+            <w:r>
+              <w:rPr>
+                <w:rFonts w:ascii="Aptos" w:hAnsi="Aptos"/>
+                <w:b w:val="0"/>
+                <w:sz w:val="17"/>
+              </w:rPr>
+              <w:t>Pass</w:t>
+            </w:r>
+          </w:p>
+        </w:tc>
+        <w:tc>
+          <w:tcPr>
+            <w:tcW w:type="dxa" w:w="1136"/>
+            <w:vAlign w:val="center"/>
+          </w:tcPr>
+          <w:p>
+            <w:pPr>
+              <w:spacing w:after="0"/>
+            </w:pPr>
+            <w:r>
+              <w:t>E1/E9; E2 record</w:t>
+            </w:r>
+          </w:p>
+        </w:tc>
+        <w:tc>
+          <w:tcPr>
+            <w:tcW w:type="dxa" w:w="1136"/>
+            <w:vAlign w:val="center"/>
+          </w:tcPr>
+          <w:p>
+            <w:pPr>
+              <w:spacing w:after="0"/>
+            </w:pPr>
+            <w:r>
+              <w:rPr>
+                <w:rFonts w:ascii="Aptos" w:hAnsi="Aptos"/>
+                <w:b w:val="0"/>
+                <w:sz w:val="17"/>
+              </w:rPr>
+              <w:t>2026-10-01</w:t>
+            </w:r>
+          </w:p>
+        </w:tc>
+      </w:tr>
+      <w:tr>
+        <w:trPr>
+          <w:cantSplit/>
+        </w:trPr>
+        <w:tc>
+          <w:tcPr>
+            <w:tcW w:type="dxa" w:w="1136"/>
+            <w:vAlign w:val="center"/>
+          </w:tcPr>
+          <w:p>
+            <w:pPr>
+              <w:spacing w:after="0"/>
+            </w:pPr>
+            <w:r>
+              <w:rPr>
+                <w:rFonts w:ascii="Aptos" w:hAnsi="Aptos"/>
+                <w:b w:val="0"/>
+                <w:sz w:val="17"/>
+              </w:rPr>
+              <w:t>S3</w:t>
+            </w:r>
+          </w:p>
+        </w:tc>
+        <w:tc>
+          <w:tcPr>
+            <w:tcW w:type="dxa" w:w="1136"/>
+            <w:vAlign w:val="center"/>
+          </w:tcPr>
+          <w:p>
+            <w:pPr>
+              <w:spacing w:after="0"/>
+            </w:pPr>
+            <w:r>
+              <w:rPr>
+                <w:rFonts w:ascii="Aptos" w:hAnsi="Aptos"/>
+                <w:b w:val="0"/>
+                <w:sz w:val="17"/>
+              </w:rPr>
+              <w:t>Delay/ordinary imports</w:t>
+            </w:r>
+          </w:p>
+        </w:tc>
+        <w:tc>
+          <w:tcPr>
+            <w:tcW w:type="dxa" w:w="1136"/>
+            <w:vAlign w:val="center"/>
+          </w:tcPr>
+          <w:p>
+            <w:pPr>
+              <w:spacing w:after="0"/>
+            </w:pPr>
+            <w:r>
+              <w:rPr>
+                <w:rFonts w:ascii="Aptos" w:hAnsi="Aptos"/>
+                <w:b w:val="0"/>
+                <w:sz w:val="17"/>
+              </w:rPr>
+              <w:t>unittest</w:t>
+            </w:r>
+          </w:p>
+        </w:tc>
+        <w:tc>
+          <w:tcPr>
+            <w:tcW w:type="dxa" w:w="1136"/>
+            <w:vAlign w:val="center"/>
+          </w:tcPr>
+          <w:p>
+            <w:pPr>
+              <w:spacing w:after="0"/>
+            </w:pPr>
+            <w:r>
+              <w:rPr>
+                <w:rFonts w:ascii="Aptos" w:hAnsi="Aptos"/>
+                <w:b w:val="0"/>
+                <w:sz w:val="17"/>
+              </w:rPr>
+              <w:t>Inert fixtures</w:t>
+            </w:r>
+          </w:p>
+        </w:tc>
+        <w:tc>
+          <w:tcPr>
+            <w:tcW w:type="dxa" w:w="1136"/>
+            <w:vAlign w:val="center"/>
+          </w:tcPr>
+          <w:p>
+            <w:pPr>
+              <w:spacing w:after="0"/>
+            </w:pPr>
+            <w:r>
+              <w:rPr>
+                <w:rFonts w:ascii="Aptos" w:hAnsi="Aptos"/>
+                <w:b w:val="0"/>
+                <w:sz w:val="17"/>
+              </w:rPr>
+              <w:t>All pass</w:t>
+            </w:r>
+          </w:p>
+        </w:tc>
+        <w:tc>
+          <w:tcPr>
+            <w:tcW w:type="dxa" w:w="1136"/>
+            <w:vAlign w:val="center"/>
+          </w:tcPr>
+          <w:p>
+            <w:pPr>
+              <w:spacing w:after="0"/>
+            </w:pPr>
+            <w:r>
+              <w:rPr>
+                <w:rFonts w:ascii="Aptos" w:hAnsi="Aptos"/>
+                <w:b w:val="0"/>
+                <w:sz w:val="17"/>
+              </w:rPr>
+              <w:t>28 passed</w:t>
+            </w:r>
+          </w:p>
+        </w:tc>
+        <w:tc>
+          <w:tcPr>
+            <w:tcW w:type="dxa" w:w="1136"/>
+            <w:vAlign w:val="center"/>
+          </w:tcPr>
+          <w:p>
+            <w:pPr>
+              <w:spacing w:after="0"/>
+            </w:pPr>
+            <w:r>
+              <w:rPr>
+                <w:rFonts w:ascii="Aptos" w:hAnsi="Aptos"/>
+                <w:b w:val="0"/>
+                <w:sz w:val="17"/>
+              </w:rPr>
+              <w:t>Pass</w:t>
+            </w:r>
+          </w:p>
+        </w:tc>
+        <w:tc>
+          <w:tcPr>
+            <w:tcW w:type="dxa" w:w="1136"/>
+            <w:vAlign w:val="center"/>
+          </w:tcPr>
+          <w:p>
+            <w:pPr>
+              <w:spacing w:after="0"/>
+            </w:pPr>
+            <w:r>
+              <w:t>E1/E9; E2 record</w:t>
+            </w:r>
+          </w:p>
+        </w:tc>
+        <w:tc>
+          <w:tcPr>
+            <w:tcW w:type="dxa" w:w="1136"/>
+            <w:vAlign w:val="center"/>
+          </w:tcPr>
+          <w:p>
+            <w:pPr>
+              <w:spacing w:after="0"/>
+            </w:pPr>
+            <w:r>
+              <w:rPr>
+                <w:rFonts w:ascii="Aptos" w:hAnsi="Aptos"/>
+                <w:b w:val="0"/>
+                <w:sz w:val="17"/>
+              </w:rPr>
+              <w:t>2026-10-01</w:t>
+            </w:r>
+          </w:p>
+        </w:tc>
+      </w:tr>
+      <w:tr>
+        <w:trPr>
+          <w:cantSplit/>
+        </w:trPr>
+        <w:tc>
+          <w:tcPr>
+            <w:tcW w:type="dxa" w:w="1136"/>
+            <w:vAlign w:val="center"/>
+          </w:tcPr>
+          <w:p>
+            <w:pPr>
+              <w:spacing w:after="0"/>
+            </w:pPr>
+            <w:r>
+              <w:rPr>
+                <w:rFonts w:ascii="Aptos" w:hAnsi="Aptos"/>
+                <w:b w:val="0"/>
+                <w:sz w:val="17"/>
+              </w:rPr>
+              <w:t>S4</w:t>
+            </w:r>
+          </w:p>
+        </w:tc>
+        <w:tc>
+          <w:tcPr>
+            <w:tcW w:type="dxa" w:w="1136"/>
+            <w:vAlign w:val="center"/>
+          </w:tcPr>
+          <w:p>
+            <w:pPr>
+              <w:spacing w:after="0"/>
+            </w:pPr>
+            <w:r>
+              <w:rPr>
+                <w:rFonts w:ascii="Aptos" w:hAnsi="Aptos"/>
+                <w:b w:val="0"/>
+                <w:sz w:val="17"/>
+              </w:rPr>
+              <w:t>String semantics</w:t>
+            </w:r>
+          </w:p>
+        </w:tc>
+        <w:tc>
+          <w:tcPr>
+            <w:tcW w:type="dxa" w:w="1136"/>
+            <w:vAlign w:val="center"/>
+          </w:tcPr>
+          <w:p>
+            <w:pPr>
+              <w:spacing w:after="0"/>
+            </w:pPr>
+            <w:r>
+              <w:rPr>
+                <w:rFonts w:ascii="Aptos" w:hAnsi="Aptos"/>
+                <w:b w:val="0"/>
+                <w:sz w:val="17"/>
+              </w:rPr>
+              <w:t>unittest</w:t>
+            </w:r>
+          </w:p>
+        </w:tc>
+        <w:tc>
+          <w:tcPr>
+            <w:tcW w:type="dxa" w:w="1136"/>
+            <w:vAlign w:val="center"/>
+          </w:tcPr>
+          <w:p>
+            <w:pPr>
+              <w:spacing w:after="0"/>
+            </w:pPr>
+            <w:r>
+              <w:rPr>
+                <w:rFonts w:ascii="Aptos" w:hAnsi="Aptos"/>
+                <w:b w:val="0"/>
+                <w:sz w:val="17"/>
+              </w:rPr>
+              <w:t>Inert fixtures</w:t>
+            </w:r>
+          </w:p>
+        </w:tc>
+        <w:tc>
+          <w:tcPr>
+            <w:tcW w:type="dxa" w:w="1136"/>
+            <w:vAlign w:val="center"/>
+          </w:tcPr>
+          <w:p>
+            <w:pPr>
+              <w:spacing w:after="0"/>
+            </w:pPr>
+            <w:r>
+              <w:rPr>
+                <w:rFonts w:ascii="Aptos" w:hAnsi="Aptos"/>
+                <w:b w:val="0"/>
+                <w:sz w:val="17"/>
+              </w:rPr>
+              <w:t>All pass</w:t>
+            </w:r>
+          </w:p>
+        </w:tc>
+        <w:tc>
+          <w:tcPr>
+            <w:tcW w:type="dxa" w:w="1136"/>
+            <w:vAlign w:val="center"/>
+          </w:tcPr>
+          <w:p>
+            <w:pPr>
+              <w:spacing w:after="0"/>
+            </w:pPr>
+            <w:r>
+              <w:rPr>
+                <w:rFonts w:ascii="Aptos" w:hAnsi="Aptos"/>
+                <w:b w:val="0"/>
+                <w:sz w:val="17"/>
+              </w:rPr>
+              <w:t>31 passed</w:t>
+            </w:r>
+          </w:p>
+        </w:tc>
+        <w:tc>
+          <w:tcPr>
+            <w:tcW w:type="dxa" w:w="1136"/>
+            <w:vAlign w:val="center"/>
+          </w:tcPr>
+          <w:p>
+            <w:pPr>
+              <w:spacing w:after="0"/>
+            </w:pPr>
+            <w:r>
+              <w:rPr>
+                <w:rFonts w:ascii="Aptos" w:hAnsi="Aptos"/>
+                <w:b w:val="0"/>
+                <w:sz w:val="17"/>
+              </w:rPr>
+              <w:t>Pass</w:t>
+            </w:r>
+          </w:p>
+        </w:tc>
+        <w:tc>
+          <w:tcPr>
+            <w:tcW w:type="dxa" w:w="1136"/>
+            <w:vAlign w:val="center"/>
+          </w:tcPr>
+          <w:p>
+            <w:pPr>
+              <w:spacing w:after="0"/>
+            </w:pPr>
+            <w:r>
+              <w:t>E1/E9; E2 record</w:t>
+            </w:r>
+          </w:p>
+        </w:tc>
+        <w:tc>
+          <w:tcPr>
+            <w:tcW w:type="dxa" w:w="1136"/>
+            <w:vAlign w:val="center"/>
+          </w:tcPr>
+          <w:p>
+            <w:pPr>
+              <w:spacing w:after="0"/>
+            </w:pPr>
+            <w:r>
+              <w:rPr>
+                <w:rFonts w:ascii="Aptos" w:hAnsi="Aptos"/>
+                <w:b w:val="0"/>
+                <w:sz w:val="17"/>
+              </w:rPr>
+              <w:t>2026-10-01</w:t>
+            </w:r>
+          </w:p>
+        </w:tc>
+      </w:tr>
+      <w:tr>
+        <w:trPr>
+          <w:cantSplit/>
+        </w:trPr>
+        <w:tc>
+          <w:tcPr>
+            <w:tcW w:type="dxa" w:w="1136"/>
+            <w:vAlign w:val="center"/>
+          </w:tcPr>
+          <w:p>
+            <w:pPr>
+              <w:spacing w:after="0"/>
+            </w:pPr>
+            <w:r>
+              <w:rPr>
+                <w:rFonts w:ascii="Aptos" w:hAnsi="Aptos"/>
+                <w:b w:val="0"/>
+                <w:sz w:val="17"/>
+              </w:rPr>
+              <w:t>S5</w:t>
+            </w:r>
+          </w:p>
+        </w:tc>
+        <w:tc>
+          <w:tcPr>
+            <w:tcW w:type="dxa" w:w="1136"/>
+            <w:vAlign w:val="center"/>
+          </w:tcPr>
+          <w:p>
+            <w:pPr>
+              <w:spacing w:after="0"/>
+            </w:pPr>
+            <w:r>
+              <w:rPr>
+                <w:rFonts w:ascii="Aptos" w:hAnsi="Aptos"/>
+                <w:b w:val="0"/>
+                <w:sz w:val="17"/>
+              </w:rPr>
+              <w:t>CLI and contract</w:t>
+            </w:r>
+          </w:p>
+        </w:tc>
+        <w:tc>
+          <w:tcPr>
+            <w:tcW w:type="dxa" w:w="1136"/>
+            <w:vAlign w:val="center"/>
+          </w:tcPr>
+          <w:p>
+            <w:pPr>
+              <w:spacing w:after="0"/>
+            </w:pPr>
+            <w:r>
+              <w:rPr>
+                <w:rFonts w:ascii="Aptos" w:hAnsi="Aptos"/>
+                <w:b w:val="0"/>
+                <w:sz w:val="17"/>
+              </w:rPr>
+              <w:t>unittest</w:t>
+            </w:r>
+          </w:p>
+        </w:tc>
+        <w:tc>
+          <w:tcPr>
+            <w:tcW w:type="dxa" w:w="1136"/>
+            <w:vAlign w:val="center"/>
+          </w:tcPr>
+          <w:p>
+            <w:pPr>
+              <w:spacing w:after="0"/>
+            </w:pPr>
+            <w:r>
+              <w:rPr>
+                <w:rFonts w:ascii="Aptos" w:hAnsi="Aptos"/>
+                <w:b w:val="0"/>
+                <w:sz w:val="17"/>
+              </w:rPr>
+              <w:t>Inert fixtures</w:t>
+            </w:r>
+          </w:p>
+        </w:tc>
+        <w:tc>
+          <w:tcPr>
+            <w:tcW w:type="dxa" w:w="1136"/>
+            <w:vAlign w:val="center"/>
+          </w:tcPr>
+          <w:p>
+            <w:pPr>
+              <w:spacing w:after="0"/>
+            </w:pPr>
+            <w:r>
+              <w:rPr>
+                <w:rFonts w:ascii="Aptos" w:hAnsi="Aptos"/>
+                <w:b w:val="0"/>
+                <w:sz w:val="17"/>
+              </w:rPr>
+              <w:t>All pass</w:t>
+            </w:r>
+          </w:p>
+        </w:tc>
+        <w:tc>
+          <w:tcPr>
+            <w:tcW w:type="dxa" w:w="1136"/>
+            <w:vAlign w:val="center"/>
+          </w:tcPr>
+          <w:p>
+            <w:pPr>
+              <w:spacing w:after="0"/>
+            </w:pPr>
+            <w:r>
+              <w:rPr>
+                <w:rFonts w:ascii="Aptos" w:hAnsi="Aptos"/>
+                <w:b w:val="0"/>
+                <w:sz w:val="17"/>
+              </w:rPr>
+              <w:t>36 passed</w:t>
+            </w:r>
+          </w:p>
+        </w:tc>
+        <w:tc>
+          <w:tcPr>
+            <w:tcW w:type="dxa" w:w="1136"/>
+            <w:vAlign w:val="center"/>
+          </w:tcPr>
+          <w:p>
+            <w:pPr>
+              <w:spacing w:after="0"/>
+            </w:pPr>
+            <w:r>
+              <w:rPr>
+                <w:rFonts w:ascii="Aptos" w:hAnsi="Aptos"/>
+                <w:b w:val="0"/>
+                <w:sz w:val="17"/>
+              </w:rPr>
+              <w:t>Pass</w:t>
+            </w:r>
+          </w:p>
+        </w:tc>
+        <w:tc>
+          <w:tcPr>
+            <w:tcW w:type="dxa" w:w="1136"/>
+            <w:vAlign w:val="center"/>
+          </w:tcPr>
+          <w:p>
+            <w:pPr>
+              <w:spacing w:after="0"/>
+            </w:pPr>
+            <w:r>
+              <w:t>E1/E9; E2 record</w:t>
+            </w:r>
+          </w:p>
+        </w:tc>
+        <w:tc>
+          <w:tcPr>
+            <w:tcW w:type="dxa" w:w="1136"/>
+            <w:vAlign w:val="center"/>
+          </w:tcPr>
+          <w:p>
+            <w:pPr>
+              <w:spacing w:after="0"/>
+            </w:pPr>
+            <w:r>
+              <w:rPr>
+                <w:rFonts w:ascii="Aptos" w:hAnsi="Aptos"/>
+                <w:b w:val="0"/>
+                <w:sz w:val="17"/>
+              </w:rPr>
+              <w:t>2026-10-01</w:t>
+            </w:r>
+          </w:p>
+        </w:tc>
+      </w:tr>
+      <w:tr>
+        <w:trPr>
+          <w:cantSplit/>
+        </w:trPr>
+        <w:tc>
+          <w:tcPr>
+            <w:tcW w:type="dxa" w:w="1136"/>
+            <w:vAlign w:val="center"/>
+          </w:tcPr>
+          <w:p>
+            <w:pPr>
+              <w:spacing w:after="0"/>
+            </w:pPr>
+            <w:r>
+              <w:rPr>
+                <w:rFonts w:ascii="Aptos" w:hAnsi="Aptos"/>
+                <w:b w:val="0"/>
+                <w:sz w:val="17"/>
+              </w:rPr>
+              <w:t>S6-demo</w:t>
+            </w:r>
+          </w:p>
+        </w:tc>
+        <w:tc>
+          <w:tcPr>
+            <w:tcW w:type="dxa" w:w="1136"/>
+            <w:vAlign w:val="center"/>
+          </w:tcPr>
+          <w:p>
+            <w:pPr>
+              <w:spacing w:after="0"/>
+            </w:pPr>
+            <w:r>
+              <w:rPr>
+                <w:rFonts w:ascii="Aptos" w:hAnsi="Aptos"/>
+                <w:b w:val="0"/>
+                <w:sz w:val="17"/>
+              </w:rPr>
+              <w:t>Trusted demo/hash</w:t>
+            </w:r>
+          </w:p>
+        </w:tc>
+        <w:tc>
+          <w:tcPr>
+            <w:tcW w:type="dxa" w:w="1136"/>
+            <w:vAlign w:val="center"/>
+          </w:tcPr>
+          <w:p>
+            <w:pPr>
+              <w:spacing w:after="0"/>
+            </w:pPr>
+            <w:r>
+              <w:rPr>
+                <w:rFonts w:ascii="Aptos" w:hAnsi="Aptos"/>
+                <w:b w:val="0"/>
+                <w:sz w:val="17"/>
+              </w:rPr>
+              <w:t>PowerShell</w:t>
+            </w:r>
+          </w:p>
+        </w:tc>
+        <w:tc>
+          <w:tcPr>
+            <w:tcW w:type="dxa" w:w="1136"/>
+            <w:vAlign w:val="center"/>
+          </w:tcPr>
+          <w:p>
+            <w:pPr>
+              <w:spacing w:after="0"/>
+            </w:pPr>
+            <w:r>
+              <w:rPr>
+                <w:rFonts w:ascii="Aptos" w:hAnsi="Aptos"/>
+                <w:b w:val="0"/>
+                <w:sz w:val="17"/>
+              </w:rPr>
+              <w:t>Signed notepad</w:t>
+            </w:r>
+          </w:p>
+        </w:tc>
+        <w:tc>
+          <w:tcPr>
+            <w:tcW w:type="dxa" w:w="1136"/>
+            <w:vAlign w:val="center"/>
+          </w:tcPr>
+          <w:p>
+            <w:pPr>
+              <w:spacing w:after="0"/>
+            </w:pPr>
+            <w:r>
+              <w:rPr>
+                <w:rFonts w:ascii="Aptos" w:hAnsi="Aptos"/>
+                <w:b w:val="0"/>
+                <w:sz w:val="17"/>
+              </w:rPr>
+              <w:t>Valid JSON; hash equal</w:t>
+            </w:r>
+          </w:p>
+        </w:tc>
+        <w:tc>
+          <w:tcPr>
+            <w:tcW w:type="dxa" w:w="1136"/>
+            <w:vAlign w:val="center"/>
+          </w:tcPr>
+          <w:p>
+            <w:pPr>
+              <w:spacing w:after="0"/>
+            </w:pPr>
+            <w:r>
+              <w:rPr>
+                <w:rFonts w:ascii="Aptos" w:hAnsi="Aptos"/>
+                <w:b w:val="0"/>
+                <w:sz w:val="17"/>
+              </w:rPr>
+              <w:t>Matched; error demo passed</w:t>
+            </w:r>
+          </w:p>
+        </w:tc>
+        <w:tc>
+          <w:tcPr>
+            <w:tcW w:type="dxa" w:w="1136"/>
+            <w:vAlign w:val="center"/>
+          </w:tcPr>
+          <w:p>
+            <w:pPr>
+              <w:spacing w:after="0"/>
+            </w:pPr>
+            <w:r>
+              <w:rPr>
+                <w:rFonts w:ascii="Aptos" w:hAnsi="Aptos"/>
+                <w:b w:val="0"/>
+                <w:sz w:val="17"/>
+              </w:rPr>
+              <w:t>Pass</w:t>
+            </w:r>
+          </w:p>
+        </w:tc>
+        <w:tc>
+          <w:tcPr>
+            <w:tcW w:type="dxa" w:w="1136"/>
+            <w:vAlign w:val="center"/>
+          </w:tcPr>
+          <w:p>
+            <w:pPr>
+              <w:spacing w:after="0"/>
+            </w:pPr>
+            <w:r>
+              <w:t>E4/E10</w:t>
+            </w:r>
+          </w:p>
+        </w:tc>
+        <w:tc>
+          <w:tcPr>
+            <w:tcW w:type="dxa" w:w="1136"/>
+            <w:vAlign w:val="center"/>
+          </w:tcPr>
+          <w:p>
+            <w:pPr>
+              <w:spacing w:after="0"/>
+            </w:pPr>
+            <w:r>
+              <w:rPr>
+                <w:rFonts w:ascii="Aptos" w:hAnsi="Aptos"/>
+                <w:b w:val="0"/>
+                <w:sz w:val="17"/>
+              </w:rPr>
+              <w:t>2026-10-01</w:t>
+            </w:r>
+          </w:p>
+        </w:tc>
+      </w:tr>
+      <w:tr>
+        <w:trPr>
+          <w:cantSplit/>
+        </w:trPr>
+        <w:tc>
+          <w:tcPr>
+            <w:tcW w:type="dxa" w:w="1136"/>
+            <w:vAlign w:val="center"/>
+          </w:tcPr>
+          <w:p>
+            <w:pPr>
+              <w:spacing w:after="0"/>
+            </w:pPr>
+            <w:r>
+              <w:rPr>
+                <w:rFonts w:ascii="Aptos" w:hAnsi="Aptos"/>
+                <w:b w:val="0"/>
+                <w:sz w:val="17"/>
+              </w:rPr>
+              <w:t>S6-doc</w:t>
+            </w:r>
+          </w:p>
+        </w:tc>
+        <w:tc>
+          <w:tcPr>
+            <w:tcW w:type="dxa" w:w="1136"/>
+            <w:vAlign w:val="center"/>
+          </w:tcPr>
+          <w:p>
+            <w:pPr>
+              <w:spacing w:after="0"/>
+            </w:pPr>
+            <w:r>
+              <w:rPr>
+                <w:rFonts w:ascii="Aptos" w:hAnsi="Aptos"/>
+                <w:b w:val="0"/>
+                <w:sz w:val="17"/>
+              </w:rPr>
+              <w:t>Word visual QA</w:t>
+            </w:r>
+          </w:p>
+        </w:tc>
+        <w:tc>
+          <w:tcPr>
+            <w:tcW w:type="dxa" w:w="1136"/>
+            <w:vAlign w:val="center"/>
+          </w:tcPr>
+          <w:p>
+            <w:pPr>
+              <w:spacing w:after="0"/>
+            </w:pPr>
+            <w:r>
+              <w:rPr>
+                <w:rFonts w:ascii="Aptos" w:hAnsi="Aptos"/>
+                <w:b w:val="0"/>
+                <w:sz w:val="17"/>
+              </w:rPr>
+              <w:t>Render</w:t>
+            </w:r>
+          </w:p>
+        </w:tc>
+        <w:tc>
+          <w:tcPr>
+            <w:tcW w:type="dxa" w:w="1136"/>
+            <w:vAlign w:val="center"/>
+          </w:tcPr>
+          <w:p>
+            <w:pPr>
+              <w:spacing w:after="0"/>
+            </w:pPr>
+            <w:r>
+              <w:rPr>
+                <w:rFonts w:ascii="Aptos" w:hAnsi="Aptos"/>
+                <w:b w:val="0"/>
+                <w:sz w:val="17"/>
+              </w:rPr>
+              <w:t>Bundled renderer</w:t>
+            </w:r>
+          </w:p>
+        </w:tc>
+        <w:tc>
+          <w:tcPr>
+            <w:tcW w:type="dxa" w:w="1136"/>
+            <w:vAlign w:val="center"/>
+          </w:tcPr>
+          <w:p>
+            <w:pPr>
+              <w:spacing w:after="0"/>
+            </w:pPr>
+            <w:r>
+              <w:rPr>
+                <w:rFonts w:ascii="Aptos" w:hAnsi="Aptos"/>
+                <w:b w:val="0"/>
+                <w:sz w:val="17"/>
+              </w:rPr>
+              <w:t>Inspect PNG pages</w:t>
+            </w:r>
+          </w:p>
+        </w:tc>
+        <w:tc>
+          <w:tcPr>
+            <w:tcW w:type="dxa" w:w="1136"/>
+            <w:vAlign w:val="center"/>
+          </w:tcPr>
+          <w:p>
+            <w:pPr>
+              <w:spacing w:after="0"/>
+            </w:pPr>
+            <w:r>
+              <w:rPr>
+                <w:rFonts w:ascii="Aptos" w:hAnsi="Aptos"/>
+                <w:b w:val="0"/>
+                <w:sz w:val="17"/>
+              </w:rPr>
+              <w:t>LibreOffice absent</w:t>
+            </w:r>
+          </w:p>
+        </w:tc>
+        <w:tc>
+          <w:tcPr>
+            <w:tcW w:type="dxa" w:w="1136"/>
+            <w:vAlign w:val="center"/>
+          </w:tcPr>
+          <w:p>
+            <w:pPr>
+              <w:spacing w:after="0"/>
+            </w:pPr>
+            <w:r>
+              <w:rPr>
+                <w:rFonts w:ascii="Aptos" w:hAnsi="Aptos"/>
+                <w:b w:val="0"/>
+                <w:sz w:val="17"/>
+              </w:rPr>
+              <w:t>Not run</w:t>
+            </w:r>
+          </w:p>
+        </w:tc>
+        <w:tc>
+          <w:tcPr>
+            <w:tcW w:type="dxa" w:w="1136"/>
+            <w:vAlign w:val="center"/>
+          </w:tcPr>
+          <w:p>
+            <w:pPr>
+              <w:spacing w:after="0"/>
+            </w:pPr>
+            <w:r>
+              <w:t>E2; form structure checked</w:t>
+            </w:r>
+          </w:p>
+        </w:tc>
+        <w:tc>
+          <w:tcPr>
+            <w:tcW w:type="dxa" w:w="1136"/>
+            <w:vAlign w:val="center"/>
+          </w:tcPr>
+          <w:p>
+            <w:pPr>
+              <w:spacing w:after="0"/>
+            </w:pPr>
+            <w:r>
+              <w:rPr>
+                <w:rFonts w:ascii="Aptos" w:hAnsi="Aptos"/>
+                <w:b w:val="0"/>
+                <w:sz w:val="17"/>
+              </w:rPr>
+              <w:t>2026-10-01</w:t>
+            </w:r>
+          </w:p>
+        </w:tc>
+      </w:tr>
     </w:tbl>
     <w:p>
       <w:pPr>
@@ -11031,7 +13374,7 @@
                 <w:b w:val="0"/>
                 <w:sz w:val="17"/>
               </w:rPr>
-              <w:t>Verified within M3</w:t>
+              <w:t>Verified S1-S5</w:t>
             </w:r>
           </w:p>
         </w:tc>
@@ -11050,7 +13393,7 @@
                 <w:b w:val="0"/>
                 <w:sz w:val="17"/>
               </w:rPr>
-              <w:t>T04-T07 validate file failures; T11-T18 check the successful report contract and validator inputs.</w:t>
+              <w:t>Size boundaries, post-stat growth, missing/empty/malformed inputs; schema and evidence consistency. See E1/E9.</w:t>
             </w:r>
           </w:p>
         </w:tc>
@@ -11132,7 +13475,7 @@
                 <w:b w:val="0"/>
                 <w:sz w:val="17"/>
               </w:rPr>
-              <w:t>Verified within M2</w:t>
+              <w:t>Verified S5</w:t>
             </w:r>
           </w:p>
         </w:tc>
@@ -11151,7 +13494,7 @@
                 <w:b w:val="0"/>
                 <w:sz w:val="17"/>
               </w:rPr>
-              <w:t>T03-T07 check exit codes and separate stdout/stderr.</w:t>
+              <w:t>Actual CLI subprocess tests verify one success JSON object, empty stderr, and separated error streams with nonzero status.</w:t>
             </w:r>
           </w:p>
         </w:tc>
@@ -11454,7 +13797,7 @@
                 <w:b w:val="0"/>
                 <w:sz w:val="17"/>
               </w:rPr>
-              <w:t>E10 contains verified setup/run/save/validate/test/error commands, function/report walkthrough, and future Node process guidance. No backend integration is implemented.</w:t>
+              <w:t>E4/E10 README has exact setup, analysis, UTF-8 save, validation, hash, tests, and invalid-input demo commands. No backend integration.</w:t>
             </w:r>
           </w:p>
         </w:tc>
@@ -11536,7 +13879,7 @@
                 <w:b w:val="0"/>
                 <w:sz w:val="17"/>
               </w:rPr>
-              <w:t>Partial; isolation deferred</w:t>
+              <w:t>Partial; no isolation</w:t>
             </w:r>
           </w:p>
         </w:tc>
@@ -11555,7 +13898,7 @@
                 <w:b w:val="0"/>
                 <w:sz w:val="17"/>
               </w:rPr>
-              <w:t>Fixtures are read only. T10 checks cleanup. No sandbox or hostile-input isolation is implemented.</w:t>
+              <w:t>50 MiB default bounded read and PE cleanup verified. Input limit is not a sandbox or a complete CPU/memory limit.</w:t>
             </w:r>
           </w:p>
         </w:tc>
@@ -11891,7 +14234,7 @@
                 <w:b w:val="0"/>
                 <w:sz w:val="17"/>
               </w:rPr>
-              <w:t>No resource limits</w:t>
+              <w:t>No complete resource isolation</w:t>
             </w:r>
           </w:p>
         </w:tc>
@@ -11910,7 +14253,7 @@
                 <w:b w:val="0"/>
                 <w:sz w:val="17"/>
               </w:rPr>
-              <w:t>Large-file memory use</w:t>
+              <w:t>Parser/unique-string memory and CPU</w:t>
             </w:r>
           </w:p>
         </w:tc>
@@ -11948,7 +14291,7 @@
                 <w:b w:val="0"/>
                 <w:sz w:val="17"/>
               </w:rPr>
-              <w:t>Trusted local inputs</w:t>
+              <w:t>50 MiB input default; trusted development files</w:t>
             </w:r>
           </w:p>
         </w:tc>
@@ -12005,7 +14348,7 @@
                 <w:b w:val="0"/>
                 <w:sz w:val="17"/>
               </w:rPr>
-              <w:t>Open</w:t>
+              <w:t>Partly mitigated; open</w:t>
             </w:r>
           </w:p>
         </w:tc>
@@ -12983,7 +15326,7 @@
                 <w:b w:val="0"/>
                 <w:sz w:val="17"/>
               </w:rPr>
-              <w:t>M2</w:t>
+              <w:t>S5</w:t>
             </w:r>
           </w:p>
         </w:tc>
@@ -13040,7 +15383,7 @@
                 <w:b w:val="0"/>
                 <w:sz w:val="17"/>
               </w:rPr>
-              <w:t>10 pass</w:t>
+              <w:t>Analyzer and CLI checks</w:t>
             </w:r>
           </w:p>
         </w:tc>
@@ -13104,7 +15447,7 @@
                   <w:sz w:val="17"/>
                   <w:rStyle w:val="Hyperlink"/>
                 </w:rPr>
-                <w:t>TESTING.md</w:t>
+                <w:t>README.md</w:t>
               </w:r>
             </w:hyperlink>
           </w:p>
@@ -13124,7 +15467,7 @@
                 <w:b w:val="0"/>
                 <w:sz w:val="17"/>
               </w:rPr>
-              <w:t>M4</w:t>
+              <w:t>S6</w:t>
             </w:r>
           </w:p>
         </w:tc>
@@ -13181,7 +15524,7 @@
                 <w:b w:val="0"/>
                 <w:sz w:val="17"/>
               </w:rPr>
-              <w:t>18 tests; 6 demo checks</w:t>
+              <w:t>README verification record: 36 tests; demo/hash</w:t>
             </w:r>
           </w:p>
         </w:tc>
@@ -13265,7 +15608,7 @@
                 <w:b w:val="0"/>
                 <w:sz w:val="17"/>
               </w:rPr>
-              <w:t>1.0.0 / M3</w:t>
+              <w:t>1.2.0 / S4</w:t>
             </w:r>
           </w:p>
         </w:tc>
@@ -13322,7 +15665,7 @@
                 <w:b w:val="0"/>
                 <w:sz w:val="17"/>
               </w:rPr>
-              <w:t>Version and sampling metadata</w:t>
+              <w:t>Bounded capture; section/warning/delay evidence</w:t>
             </w:r>
           </w:p>
         </w:tc>
@@ -13406,7 +15749,7 @@
                 <w:b w:val="0"/>
                 <w:sz w:val="17"/>
               </w:rPr>
-              <w:t>M4</w:t>
+              <w:t>S6</w:t>
             </w:r>
           </w:p>
         </w:tc>
@@ -13463,7 +15806,7 @@
                 <w:b w:val="0"/>
                 <w:sz w:val="17"/>
               </w:rPr>
-              <w:t>Pinned dependency</w:t>
+              <w:t>Exact repository-root PowerShell commands</w:t>
             </w:r>
           </w:p>
         </w:tc>
@@ -13527,7 +15870,7 @@
                   <w:sz w:val="17"/>
                   <w:rStyle w:val="Hyperlink"/>
                 </w:rPr>
-                <w:t>STATUS.md</w:t>
+                <w:t>README.md</w:t>
               </w:r>
             </w:hyperlink>
           </w:p>
@@ -13547,7 +15890,7 @@
                 <w:b w:val="0"/>
                 <w:sz w:val="17"/>
               </w:rPr>
-              <w:t>M4</w:t>
+              <w:t>S6</w:t>
             </w:r>
           </w:p>
         </w:tc>
@@ -13604,7 +15947,7 @@
                 <w:b w:val="0"/>
                 <w:sz w:val="17"/>
               </w:rPr>
-              <w:t>All four milestones complete</w:t>
+              <w:t>README limits and remaining work</w:t>
             </w:r>
           </w:p>
         </w:tc>
@@ -13685,7 +16028,7 @@
                 <w:b w:val="0"/>
                 <w:sz w:val="17"/>
               </w:rPr>
-              <w:t>1.0.0</w:t>
+              <w:t>1.2.0</w:t>
             </w:r>
           </w:p>
         </w:tc>
@@ -13742,7 +16085,7 @@
                 <w:b w:val="0"/>
                 <w:sz w:val="17"/>
               </w:rPr>
-              <w:t>Draft 2020-12</w:t>
+              <w:t>Strict Draft 2020-12</w:t>
             </w:r>
           </w:p>
         </w:tc>
@@ -13823,7 +16166,7 @@
                 <w:b w:val="0"/>
                 <w:sz w:val="17"/>
               </w:rPr>
-              <w:t>1.0.0</w:t>
+              <w:t>1.2.0</w:t>
             </w:r>
           </w:p>
         </w:tc>
@@ -13880,7 +16223,7 @@
                 <w:b w:val="0"/>
                 <w:sz w:val="17"/>
               </w:rPr>
-              <w:t>Units; sampling; ML boundary</w:t>
+              <w:t>Fields; versions; limits; ML boundary</w:t>
             </w:r>
           </w:p>
         </w:tc>
@@ -13961,7 +16304,7 @@
                 <w:b w:val="0"/>
                 <w:sz w:val="17"/>
               </w:rPr>
-              <w:t>M3</w:t>
+              <w:t>1.2.0</w:t>
             </w:r>
           </w:p>
         </w:tc>
@@ -14018,7 +16361,7 @@
                 <w:b w:val="0"/>
                 <w:sz w:val="17"/>
               </w:rPr>
-              <w:t>UTF-8 file / stdin</w:t>
+              <w:t>Schema, counts, permission masks, delay DLLs</w:t>
             </w:r>
           </w:p>
         </w:tc>
@@ -14099,7 +16442,7 @@
                 <w:b w:val="0"/>
                 <w:sz w:val="17"/>
               </w:rPr>
-              <w:t>M3</w:t>
+              <w:t>S5</w:t>
             </w:r>
           </w:p>
         </w:tc>
@@ -14156,7 +16499,7 @@
                 <w:b w:val="0"/>
                 <w:sz w:val="17"/>
               </w:rPr>
-              <w:t>8 new tests</w:t>
+              <w:t>Schema and subprocess integration</w:t>
             </w:r>
           </w:p>
         </w:tc>
@@ -14217,7 +16560,7 @@
                 <w:rPr>
                   <w:rStyle w:val="Hyperlink"/>
                 </w:rPr>
-                <w:t>DEMO_AND_HANDOFF.md</w:t>
+                <w:t>README.md</w:t>
               </w:r>
             </w:hyperlink>
           </w:p>
@@ -14237,7 +16580,7 @@
                 <w:b w:val="0"/>
                 <w:sz w:val="17"/>
               </w:rPr>
-              <w:t>M4</w:t>
+              <w:t>S6</w:t>
             </w:r>
           </w:p>
         </w:tc>
@@ -14294,7 +16637,7 @@
                 <w:b w:val="0"/>
                 <w:sz w:val="17"/>
               </w:rPr>
-              <w:t>Commands and walkthrough</w:t>
+              <w:t>README demo and team handoff</w:t>
             </w:r>
           </w:p>
         </w:tc>
@@ -14427,7 +16770,7 @@
                 <w:b w:val="0"/>
                 <w:sz w:val="17"/>
               </w:rPr>
-              <w:t>M1-M4 delivered: local PE evidence analyzer, 18 automated checks, validated JSON contract 1.0.0, and verified demo/handoff guide. Team acceptance remains pending; no classifier or backend service is delivered.</w:t>
+              <w:t>Six local improvements on static-link-analysis: bounded consistent-byte analysis, permissions/warnings, delay imports, bounded sample storage, 36 tests, and repeatable demo. Report 1.2.0; team acceptance pending.</w:t>
             </w:r>
           </w:p>
         </w:tc>
@@ -14473,7 +16816,7 @@
                 <w:b w:val="0"/>
                 <w:sz w:val="17"/>
               </w:rPr>
-              <w:t>Read bytes, hash, parse PE metadata, and emit versioned evidence JSON. A separate helper validates the schema and counts. E10 explains every function and report group and the planned Node.js process boundary; ML feature transformation remains future work.</w:t>
+              <w:t>Capture bounded bytes once; hash, extract strings, and parse PE evidence from them. Emit one JSON report. Validator checks schema and relationships. ML team must agree feature selection and preprocessing; JSON is not a ready-made model vector.</w:t>
             </w:r>
           </w:p>
         </w:tc>
@@ -14519,7 +16862,7 @@
                 <w:b w:val="0"/>
                 <w:sz w:val="17"/>
               </w:rPr>
-              <w:t>M1-M4 acceptance checks passed. Broader proposal FR02/FR03/FR06/FR07 acceptance is not claimed; full mapping requires the requirement definitions.</w:t>
+              <w:t>S1-S6 checks passed, with the 500-character cap deferred by explicit direction. Existing M1-M4 history retained. Full proposal mapping and team acceptance remain pending.</w:t>
             </w:r>
           </w:p>
         </w:tc>
@@ -14565,7 +16908,7 @@
                 <w:b w:val="0"/>
                 <w:sz w:val="17"/>
               </w:rPr>
-              <w:t>Follow E10 in PowerShell from the repository root. Includes exact setup, run, UTF-8 save, validation, hash comparison, tests, and intentional-error commands. E7 defines fields and versions.</w:t>
+              <w:t>E4/E10 now point to malware_detection/README.md: exact PowerShell setup/run/save/validate/hash/test/error commands from repository root. E7 defines all fields and versions.</w:t>
             </w:r>
           </w:p>
         </w:tc>
@@ -14611,7 +16954,7 @@
                 <w:b w:val="0"/>
                 <w:sz w:val="17"/>
               </w:rPr>
-              <w:t>18 automated tests passed again. Six demo checks passed: setup, signed-file analysis, saved-report validation/hash, regression suite, missing input, and invalid text. Existing .venv reused; fresh-environment creation not exercised. Evidence: E2.</w:t>
+              <w:t>Baseline 18 passed; milestone suites 23, 26, 28, 31, and 36 passed. Existing environment install/pip check passed. Signed notepad analysis, UTF-8 file/stdin validation, independent Get-FileHash, and invalid text demonstration passed. Fresh environment and stress benchmarks not run.</w:t>
             </w:r>
           </w:p>
         </w:tc>
@@ -14657,7 +17000,7 @@
                 <w:b w:val="0"/>
                 <w:sz w:val="17"/>
               </w:rPr>
-              <w:t>No malware verdict, production resource limits, sandbox, full PE architecture coverage, or complete string/import coverage. Header timestamp is untrusted; entropy/imports are observations. Word visual QA pending because LibreOffice is absent.</w:t>
+              <w:t>50 MiB default is not a sandbox or full CPU/memory limit. Exact deduplication retains all unique values; full sample strings can be long. Imports do not reveal every dynamic resolution. Unicode/PE coverage is incomplete. Word visual QA not run: LibreOffice absent; structural checks passed.</w:t>
             </w:r>
           </w:p>
         </w:tc>
@@ -14703,7 +17046,7 @@
                 <w:b w:val="0"/>
                 <w:sz w:val="17"/>
               </w:rPr>
-              <w:t>All four requested milestones complete. Team approval, proposal mapping, and Word visual review remain pending. Signature catalogs, YARA, ML features, and backend integration require future agreed scope.</w:t>
+              <w:t>URL analysis, YARA, hash reputation lookups, ML feature/preprocessing agreement, and backend integration remain future work. Character cap deferred. Team approval, proposal mapping, resource isolation, and Word visual review remain pending.</w:t>
             </w:r>
           </w:p>
         </w:tc>
@@ -14795,7 +17138,7 @@
                 <w:b w:val="0"/>
                 <w:sz w:val="17"/>
               </w:rPr>
-              <w:t>E1-E10 and this structured form. Include verification results and limitations; generated reports and test binaries are not source-controlled deliverables.</w:t>
+              <w:t>Review the six local commits and E1-E10 paths in this form. No generated scan reports, fixtures, environments, or caches are committed.</w:t>
             </w:r>
           </w:p>
         </w:tc>

</xml_diff>